<commit_message>
Signed-off-by: svahsek <ks@keshavs.com> FPG
</commit_message>
<xml_diff>
--- a/docs/setup/cookbook.docx
+++ b/docs/setup/cookbook.docx
@@ -2,7 +2,30 @@
 <file path=word/document.xml><?xml version="1.0" encoding="utf-8"?>
 <w:document xmlns:w="http://schemas.openxmlformats.org/wordprocessingml/2006/main" xmlns:m="http://schemas.openxmlformats.org/officeDocument/2006/math" xmlns:r="http://schemas.openxmlformats.org/officeDocument/2006/relationships" xmlns:o="urn:schemas-microsoft-com:office:office" xmlns:v="urn:schemas-microsoft-com:vml" xmlns:w10="urn:schemas-microsoft-com:office:word" xmlns:a="http://schemas.openxmlformats.org/drawingml/2006/main" xmlns:pic="http://schemas.openxmlformats.org/drawingml/2006/picture" xmlns:wp="http://schemas.openxmlformats.org/drawingml/2006/wordprocessingDrawing">
   <w:body>
-    <w:bookmarkStart w:id="13" w:name="cookbook"/>
+    <w:tbl>
+      <w:tblPr>
+        <w:tblStyle w:val="Table"/>
+        <w:tblW w:type="auto" w:w="0"/>
+        <w:tblLook w:firstRow="0" w:lastRow="0" w:firstColumn="0" w:lastColumn="0" w:noHBand="0" w:noVBand="0" w:val="0000"/>
+      </w:tblPr>
+      <w:tblGrid>
+        <w:gridCol w:w="7920"/>
+      </w:tblGrid>
+      <w:tr>
+        <w:tc>
+          <w:tcPr/>
+          <w:p>
+            <w:pPr>
+              <w:pStyle w:val="Compact"/>
+            </w:pPr>
+            <w:r>
+              <w:t xml:space="preserve">hidden: true</w:t>
+            </w:r>
+          </w:p>
+        </w:tc>
+      </w:tr>
+    </w:tbl>
+    <w:bookmarkStart w:id="9" w:name="cookbook"/>
     <w:p>
       <w:pPr>
         <w:pStyle w:val="Heading1"/>
@@ -11,10 +34,947 @@
         <w:t xml:space="preserve">CookBook</w:t>
       </w:r>
     </w:p>
+    <w:bookmarkEnd w:id="9"/>
+    <w:bookmarkStart w:id="10" w:name="proposed-ia"/>
+    <w:p>
+      <w:pPr>
+        <w:pStyle w:val="Heading1"/>
+      </w:pPr>
+      <w:r>
+        <w:t xml:space="preserve">proposed IA</w:t>
+      </w:r>
+    </w:p>
     <w:p>
       <w:pPr>
         <w:pStyle w:val="FirstParagraph"/>
       </w:pPr>
+      <w:r>
+        <w:t xml:space="preserve">My recommendation: MOSIP Functional Pilot Guide — it’s unambiguous, professional, and will sit naturally alongside the other guides in the MOSIP docs navigation.</w:t>
+      </w:r>
+    </w:p>
+    <w:p>
+      <w:pPr>
+        <w:pStyle w:val="BodyText"/>
+      </w:pPr>
+      <w:r>
+        <w:t xml:space="preserve">✻ Worked for 32s</w:t>
+      </w:r>
+    </w:p>
+    <w:p>
+      <w:pPr>
+        <w:pStyle w:val="BodyText"/>
+      </w:pPr>
+      <w:r>
+        <w:t xml:space="preserve">❯ Now, as per docs information architecture principles and also as per topic based authoring ways suggest me some better logical segregation for this large content page such that I break this further into logical units/topics/pages</w:t>
+      </w:r>
+    </w:p>
+    <w:p>
+      <w:pPr>
+        <w:pStyle w:val="BodyText"/>
+      </w:pPr>
+      <w:r>
+        <w:t xml:space="preserve">Let me analyze the full 25-section document against information architecture and topic-based authoring principles before making recommendations.</w:t>
+      </w:r>
+    </w:p>
+    <w:p>
+      <w:pPr>
+        <w:pStyle w:val="BodyText"/>
+      </w:pPr>
+      <w:r>
+        <w:t xml:space="preserve">Searched for 2 patterns, ran 1 shell command</w:t>
+      </w:r>
+    </w:p>
+    <w:p>
+      <w:pPr>
+        <w:pStyle w:val="BodyText"/>
+      </w:pPr>
+      <w:r>
+        <w:t xml:space="preserve">Now I have full context — the content, the existing docs/setup/ structure, and the MOSIP navigation patterns. Let me map the 25 sections against IA and topic-based authoring principles.</w:t>
+      </w:r>
+    </w:p>
+    <w:p>
+      <w:pPr>
+        <w:pStyle w:val="BodyText"/>
+      </w:pPr>
+      <w:r>
+        <w:t xml:space="preserve">Analysis: Problems with the Current Structure</w:t>
+      </w:r>
+    </w:p>
+    <w:p>
+      <w:pPr>
+        <w:pStyle w:val="BodyText"/>
+      </w:pPr>
+      <w:r>
+        <w:t xml:space="preserve">Before recommendations, here’s what the current flat page violates:</w:t>
+      </w:r>
+    </w:p>
+    <w:p>
+      <w:pPr>
+        <w:pStyle w:val="BodyText"/>
+      </w:pPr>
+      <w:r>
+        <w:t xml:space="preserve">┌────────────────────┬─────────────────────────────────────────────────────────────────────────────────────────────────────────────┐</w:t>
+      </w:r>
+      <w:r>
+        <w:t xml:space="preserve"> </w:t>
+      </w:r>
+      <w:r>
+        <w:t xml:space="preserve">│ Principle │ Problem │</w:t>
+      </w:r>
+      <w:r>
+        <w:t xml:space="preserve"> </w:t>
+      </w:r>
+      <w:r>
+        <w:t xml:space="preserve">├────────────────────┼─────────────────────────────────────────────────────────────────────────────────────────────────────────────┤</w:t>
+      </w:r>
+      <w:r>
+        <w:t xml:space="preserve"> </w:t>
+      </w:r>
+      <w:r>
+        <w:t xml:space="preserve">│ One topic = one │ Single page mixes concept, task, and reference topics — e.g., hardware specs (reference) sits next to │</w:t>
+      </w:r>
+      <w:r>
+        <w:t xml:space="preserve"> </w:t>
+      </w:r>
+      <w:r>
+        <w:t xml:space="preserve">│ purpose │ governance cadence (reference) sits next to registration workflow (task) │</w:t>
+      </w:r>
+      <w:r>
+        <w:t xml:space="preserve"> </w:t>
+      </w:r>
+      <w:r>
+        <w:t xml:space="preserve">├────────────────────┼─────────────────────────────────────────────────────────────────────────────────────────────────────────────┤</w:t>
+      </w:r>
+      <w:r>
+        <w:t xml:space="preserve"> </w:t>
+      </w:r>
+      <w:r>
+        <w:t xml:space="preserve">│ Audience alignment │ A program manager, technical lead, and field operator all need different parts — currently forced to scroll │</w:t>
+      </w:r>
+      <w:r>
+        <w:t xml:space="preserve"> </w:t>
+      </w:r>
+      <w:r>
+        <w:t xml:space="preserve">│ │ past irrelevant content │</w:t>
+      </w:r>
+      <w:r>
+        <w:t xml:space="preserve"> </w:t>
+      </w:r>
+      <w:r>
+        <w:t xml:space="preserve">├────────────────────┼─────────────────────────────────────────────────────────────────────────────────────────────────────────────┤</w:t>
+      </w:r>
+      <w:r>
+        <w:t xml:space="preserve"> </w:t>
+      </w:r>
+      <w:r>
+        <w:t xml:space="preserve">│ Progressive │ No hierarchy — everything is at the same depth │</w:t>
+      </w:r>
+      <w:r>
+        <w:t xml:space="preserve"> </w:t>
+      </w:r>
+      <w:r>
+        <w:t xml:space="preserve">│ disclosure │ │</w:t>
+      </w:r>
+      <w:r>
+        <w:t xml:space="preserve"> </w:t>
+      </w:r>
+      <w:r>
+        <w:t xml:space="preserve">├────────────────────┼─────────────────────────────────────────────────────────────────────────────────────────────────────────────┤</w:t>
+      </w:r>
+      <w:r>
+        <w:t xml:space="preserve"> </w:t>
+      </w:r>
+      <w:r>
+        <w:t xml:space="preserve">│ Reusability │ Appendix A (Center Checklist) and Appendix B (Run Sheet) are buried and can’t be linked to independently │</w:t>
+      </w:r>
+      <w:r>
+        <w:t xml:space="preserve"> </w:t>
+      </w:r>
+      <w:r>
+        <w:t xml:space="preserve">├────────────────────┼─────────────────────────────────────────────────────────────────────────────────────────────────────────────┤</w:t>
+      </w:r>
+      <w:r>
+        <w:t xml:space="preserve"> </w:t>
+      </w:r>
+      <w:r>
+        <w:t xml:space="preserve">│ Findability │ 25 sections in one page means zero left-nav discoverability in GitBook │</w:t>
+      </w:r>
+      <w:r>
+        <w:t xml:space="preserve"> </w:t>
+      </w:r>
+      <w:r>
+        <w:t xml:space="preserve">└────────────────────┴─────────────────────────────────────────────────────────────────────────────────────────────────────────────┘</w:t>
+      </w:r>
+    </w:p>
+    <w:p>
+      <w:pPr>
+        <w:pStyle w:val="SourceCode"/>
+      </w:pPr>
+      <w:r>
+        <w:rPr>
+          <w:rStyle w:val="VerbatimChar"/>
+        </w:rPr>
+        <w:t xml:space="preserve">Proposed Structure: 1 Page → 19 Pages</w:t>
+      </w:r>
+      <w:r>
+        <w:br/>
+      </w:r>
+      <w:r>
+        <w:br/>
+      </w:r>
+      <w:r>
+        <w:rPr>
+          <w:rStyle w:val="VerbatimChar"/>
+        </w:rPr>
+        <w:t xml:space="preserve">Organized by pilot lifecycle phase (the reader's mental model), with topic type labeled for each page.</w:t>
+      </w:r>
+      <w:r>
+        <w:br/>
+      </w:r>
+      <w:r>
+        <w:br/>
+      </w:r>
+      <w:r>
+        <w:rPr>
+          <w:rStyle w:val="VerbatimChar"/>
+        </w:rPr>
+        <w:t xml:space="preserve">📁 MOSIP Functional Pilot Guide        ← parent section in GitBook nav</w:t>
+      </w:r>
+      <w:r>
+        <w:br/>
+      </w:r>
+      <w:r>
+        <w:rPr>
+          <w:rStyle w:val="VerbatimChar"/>
+        </w:rPr>
+        <w:t xml:space="preserve">│</w:t>
+      </w:r>
+      <w:r>
+        <w:br/>
+      </w:r>
+      <w:r>
+        <w:rPr>
+          <w:rStyle w:val="VerbatimChar"/>
+        </w:rPr>
+        <w:t xml:space="preserve">├── README.md  — Overview              [CONCEPT] Merge §1+2+3+4</w:t>
+      </w:r>
+      <w:r>
+        <w:br/>
+      </w:r>
+      <w:r>
+        <w:rPr>
+          <w:rStyle w:val="VerbatimChar"/>
+        </w:rPr>
+        <w:t xml:space="preserve">│   What is a MOSIP Pilot, objectives,</w:t>
+      </w:r>
+      <w:r>
+        <w:br/>
+      </w:r>
+      <w:r>
+        <w:rPr>
+          <w:rStyle w:val="VerbatimChar"/>
+        </w:rPr>
+        <w:t xml:space="preserve">│   scope, assumptions, lifecycle at a glance</w:t>
+      </w:r>
+      <w:r>
+        <w:br/>
+      </w:r>
+      <w:r>
+        <w:rPr>
+          <w:rStyle w:val="VerbatimChar"/>
+        </w:rPr>
+        <w:t xml:space="preserve">│</w:t>
+      </w:r>
+      <w:r>
+        <w:br/>
+      </w:r>
+      <w:r>
+        <w:rPr>
+          <w:rStyle w:val="VerbatimChar"/>
+        </w:rPr>
+        <w:t xml:space="preserve">├── 📁 Planning</w:t>
+      </w:r>
+      <w:r>
+        <w:br/>
+      </w:r>
+      <w:r>
+        <w:rPr>
+          <w:rStyle w:val="VerbatimChar"/>
+        </w:rPr>
+        <w:t xml:space="preserve">│   ├── execution-plan.md              [TASK]      §7 — Week-by-Week Plan</w:t>
+      </w:r>
+      <w:r>
+        <w:br/>
+      </w:r>
+      <w:r>
+        <w:rPr>
+          <w:rStyle w:val="VerbatimChar"/>
+        </w:rPr>
+        <w:t xml:space="preserve">│   ├── roles-and-responsibilities.md  [REFERENCE] §8 — RACI across Country + MOSIP</w:t>
+      </w:r>
+      <w:r>
+        <w:br/>
+      </w:r>
+      <w:r>
+        <w:rPr>
+          <w:rStyle w:val="VerbatimChar"/>
+        </w:rPr>
+        <w:t xml:space="preserve">│   ├── team-resourcing.md             [REFERENCE] §9 — Country team staffing table</w:t>
+      </w:r>
+      <w:r>
+        <w:br/>
+      </w:r>
+      <w:r>
+        <w:rPr>
+          <w:rStyle w:val="VerbatimChar"/>
+        </w:rPr>
+        <w:t xml:space="preserve">│   └── governance.md                 [REFERENCE] §23 — Meeting cadence</w:t>
+      </w:r>
+      <w:r>
+        <w:br/>
+      </w:r>
+      <w:r>
+        <w:rPr>
+          <w:rStyle w:val="VerbatimChar"/>
+        </w:rPr>
+        <w:t xml:space="preserve">│</w:t>
+      </w:r>
+      <w:r>
+        <w:br/>
+      </w:r>
+      <w:r>
+        <w:rPr>
+          <w:rStyle w:val="VerbatimChar"/>
+        </w:rPr>
+        <w:t xml:space="preserve">├── 📁 Infrastructure and Requirements</w:t>
+      </w:r>
+      <w:r>
+        <w:br/>
+      </w:r>
+      <w:r>
+        <w:rPr>
+          <w:rStyle w:val="VerbatimChar"/>
+        </w:rPr>
+        <w:t xml:space="preserve">│   ├── hardware-requirements.md       [REFERENCE] §5 — VMs, laptops, devices, scanners</w:t>
+      </w:r>
+      <w:r>
+        <w:br/>
+      </w:r>
+      <w:r>
+        <w:rPr>
+          <w:rStyle w:val="VerbatimChar"/>
+        </w:rPr>
+        <w:t xml:space="preserve">│   └── software-requirements.md       [REFERENCE] §6 — Platform components, owners</w:t>
+      </w:r>
+      <w:r>
+        <w:br/>
+      </w:r>
+      <w:r>
+        <w:rPr>
+          <w:rStyle w:val="VerbatimChar"/>
+        </w:rPr>
+        <w:t xml:space="preserve">│</w:t>
+      </w:r>
+      <w:r>
+        <w:br/>
+      </w:r>
+      <w:r>
+        <w:rPr>
+          <w:rStyle w:val="VerbatimChar"/>
+        </w:rPr>
+        <w:t xml:space="preserve">├── 📁 Pilot Design</w:t>
+      </w:r>
+      <w:r>
+        <w:br/>
+      </w:r>
+      <w:r>
+        <w:rPr>
+          <w:rStyle w:val="VerbatimChar"/>
+        </w:rPr>
+        <w:t xml:space="preserve">│   └── participant-mix.md             [TASK]      §10 — Demographic distribution</w:t>
+      </w:r>
+      <w:r>
+        <w:br/>
+      </w:r>
+      <w:r>
+        <w:rPr>
+          <w:rStyle w:val="VerbatimChar"/>
+        </w:rPr>
+        <w:t xml:space="preserve">│</w:t>
+      </w:r>
+      <w:r>
+        <w:br/>
+      </w:r>
+      <w:r>
+        <w:rPr>
+          <w:rStyle w:val="VerbatimChar"/>
+        </w:rPr>
+        <w:t xml:space="preserve">├── 📁 Training</w:t>
+      </w:r>
+      <w:r>
+        <w:br/>
+      </w:r>
+      <w:r>
+        <w:rPr>
+          <w:rStyle w:val="VerbatimChar"/>
+        </w:rPr>
+        <w:t xml:space="preserve">│   └── training-and-scenarios.md      [TASK]      §14 — Training streams + real-life scenarios</w:t>
+      </w:r>
+      <w:r>
+        <w:br/>
+      </w:r>
+      <w:r>
+        <w:rPr>
+          <w:rStyle w:val="VerbatimChar"/>
+        </w:rPr>
+        <w:t xml:space="preserve">│</w:t>
+      </w:r>
+      <w:r>
+        <w:br/>
+      </w:r>
+      <w:r>
+        <w:rPr>
+          <w:rStyle w:val="VerbatimChar"/>
+        </w:rPr>
+        <w:t xml:space="preserve">├── 📁 Platform Readiness</w:t>
+      </w:r>
+      <w:r>
+        <w:br/>
+      </w:r>
+      <w:r>
+        <w:rPr>
+          <w:rStyle w:val="VerbatimChar"/>
+        </w:rPr>
+        <w:t xml:space="preserve">│   ├── functional-capabilities.md     [REFERENCE] §15 — Capability checklist</w:t>
+      </w:r>
+      <w:r>
+        <w:br/>
+      </w:r>
+      <w:r>
+        <w:rPr>
+          <w:rStyle w:val="VerbatimChar"/>
+        </w:rPr>
+        <w:t xml:space="preserve">│   └── sandbox-hardening.md           [TASK]      §16 — Clean + tighten before go-live</w:t>
+      </w:r>
+      <w:r>
+        <w:br/>
+      </w:r>
+      <w:r>
+        <w:rPr>
+          <w:rStyle w:val="VerbatimChar"/>
+        </w:rPr>
+        <w:t xml:space="preserve">│</w:t>
+      </w:r>
+      <w:r>
+        <w:br/>
+      </w:r>
+      <w:r>
+        <w:rPr>
+          <w:rStyle w:val="VerbatimChar"/>
+        </w:rPr>
+        <w:t xml:space="preserve">├── 📁 Field Operations</w:t>
+      </w:r>
+      <w:r>
+        <w:br/>
+      </w:r>
+      <w:r>
+        <w:rPr>
+          <w:rStyle w:val="VerbatimChar"/>
+        </w:rPr>
+        <w:t xml:space="preserve">│   ├── registration-center-setup.md   [TASK+REF]  §17 — Center layout, staff, per-kit config</w:t>
+      </w:r>
+      <w:r>
+        <w:br/>
+      </w:r>
+      <w:r>
+        <w:rPr>
+          <w:rStyle w:val="VerbatimChar"/>
+        </w:rPr>
+        <w:t xml:space="preserve">│   ├── registration-workflow.md       [TASK]      §18 — Step-by-step operator script</w:t>
+      </w:r>
+      <w:r>
+        <w:br/>
+      </w:r>
+      <w:r>
+        <w:rPr>
+          <w:rStyle w:val="VerbatimChar"/>
+        </w:rPr>
+        <w:t xml:space="preserve">│   ├── online-offline-registration.md [CONCEPT]   §11 — Modes and trade-offs</w:t>
+      </w:r>
+      <w:r>
+        <w:br/>
+      </w:r>
+      <w:r>
+        <w:rPr>
+          <w:rStyle w:val="VerbatimChar"/>
+        </w:rPr>
+        <w:t xml:space="preserve">│   └── biometric-capture.md           [TASK]      §19 — Best practices per modality</w:t>
+      </w:r>
+      <w:r>
+        <w:br/>
+      </w:r>
+      <w:r>
+        <w:rPr>
+          <w:rStyle w:val="VerbatimChar"/>
+        </w:rPr>
+        <w:t xml:space="preserve">│</w:t>
+      </w:r>
+      <w:r>
+        <w:br/>
+      </w:r>
+      <w:r>
+        <w:rPr>
+          <w:rStyle w:val="VerbatimChar"/>
+        </w:rPr>
+        <w:t xml:space="preserve">├── 📁 Authentication and Credentials</w:t>
+      </w:r>
+      <w:r>
+        <w:br/>
+      </w:r>
+      <w:r>
+        <w:rPr>
+          <w:rStyle w:val="VerbatimChar"/>
+        </w:rPr>
+        <w:t xml:space="preserve">│   ├── esignet-authentication.md      [TASK]      §12 — OTP + biometric flows</w:t>
+      </w:r>
+      <w:r>
+        <w:br/>
+      </w:r>
+      <w:r>
+        <w:rPr>
+          <w:rStyle w:val="VerbatimChar"/>
+        </w:rPr>
+        <w:t xml:space="preserve">│   └── inji-wallet.md                 [TASK]      §13 — Credential issuance + edge cases</w:t>
+      </w:r>
+      <w:r>
+        <w:br/>
+      </w:r>
+      <w:r>
+        <w:rPr>
+          <w:rStyle w:val="VerbatimChar"/>
+        </w:rPr>
+        <w:t xml:space="preserve">│</w:t>
+      </w:r>
+      <w:r>
+        <w:br/>
+      </w:r>
+      <w:r>
+        <w:rPr>
+          <w:rStyle w:val="VerbatimChar"/>
+        </w:rPr>
+        <w:t xml:space="preserve">├── 📁 Go-Live</w:t>
+      </w:r>
+      <w:r>
+        <w:br/>
+      </w:r>
+      <w:r>
+        <w:rPr>
+          <w:rStyle w:val="VerbatimChar"/>
+        </w:rPr>
+        <w:t xml:space="preserve">│   ├── user-acceptance-testing.md     [TASK]      §20 — UAT exit criteria + scenarios</w:t>
+      </w:r>
+      <w:r>
+        <w:br/>
+      </w:r>
+      <w:r>
+        <w:rPr>
+          <w:rStyle w:val="VerbatimChar"/>
+        </w:rPr>
+        <w:t xml:space="preserve">│   ├── pre-golive-readiness.md        [TASK]      §21 — Readiness sweep</w:t>
+      </w:r>
+      <w:r>
+        <w:br/>
+      </w:r>
+      <w:r>
+        <w:rPr>
+          <w:rStyle w:val="VerbatimChar"/>
+        </w:rPr>
+        <w:t xml:space="preserve">│   └── golive-strategy.md             [TASK]      §22 — Internal then external, ramp</w:t>
+      </w:r>
+      <w:r>
+        <w:br/>
+      </w:r>
+      <w:r>
+        <w:rPr>
+          <w:rStyle w:val="VerbatimChar"/>
+        </w:rPr>
+        <w:t xml:space="preserve">│</w:t>
+      </w:r>
+      <w:r>
+        <w:br/>
+      </w:r>
+      <w:r>
+        <w:rPr>
+          <w:rStyle w:val="VerbatimChar"/>
+        </w:rPr>
+        <w:t xml:space="preserve">├── 📁 Closure</w:t>
+      </w:r>
+      <w:r>
+        <w:br/>
+      </w:r>
+      <w:r>
+        <w:rPr>
+          <w:rStyle w:val="VerbatimChar"/>
+        </w:rPr>
+        <w:t xml:space="preserve">│   └── pilot-closure.md               [TASK]      §25 — Formal closure + deliverables</w:t>
+      </w:r>
+      <w:r>
+        <w:br/>
+      </w:r>
+      <w:r>
+        <w:rPr>
+          <w:rStyle w:val="VerbatimChar"/>
+        </w:rPr>
+        <w:t xml:space="preserve">│</w:t>
+      </w:r>
+      <w:r>
+        <w:br/>
+      </w:r>
+      <w:r>
+        <w:rPr>
+          <w:rStyle w:val="VerbatimChar"/>
+        </w:rPr>
+        <w:t xml:space="preserve">└── 📁 Reference</w:t>
+      </w:r>
+      <w:r>
+        <w:br/>
+      </w:r>
+      <w:r>
+        <w:rPr>
+          <w:rStyle w:val="VerbatimChar"/>
+        </w:rPr>
+        <w:t xml:space="preserve">    ├── critical-success-factors.md    [REFERENCE] §24 — Risks + mitigations</w:t>
+      </w:r>
+      <w:r>
+        <w:br/>
+      </w:r>
+      <w:r>
+        <w:rPr>
+          <w:rStyle w:val="VerbatimChar"/>
+        </w:rPr>
+        <w:t xml:space="preserve">    ├── registration-center-checklist.md [REFERENCE] Appendix A — Print-ready checklist</w:t>
+      </w:r>
+      <w:r>
+        <w:br/>
+      </w:r>
+      <w:r>
+        <w:rPr>
+          <w:rStyle w:val="VerbatimChar"/>
+        </w:rPr>
+        <w:t xml:space="preserve">    ├── operator-run-sheet.md          [REFERENCE] Appendix B — Day-of run sheet</w:t>
+      </w:r>
+      <w:r>
+        <w:br/>
+      </w:r>
+      <w:r>
+        <w:rPr>
+          <w:rStyle w:val="VerbatimChar"/>
+        </w:rPr>
+        <w:t xml:space="preserve">    └── security-and-privacy.md        [CONCEPT]   Appendix C — Security principles observed</w:t>
+      </w:r>
+      <w:r>
+        <w:br/>
+      </w:r>
+      <w:r>
+        <w:br/>
+      </w:r>
+      <w:r>
+        <w:rPr>
+          <w:rStyle w:val="VerbatimChar"/>
+        </w:rPr>
+        <w:t xml:space="preserve">Key Decisions Explained</w:t>
+      </w:r>
+      <w:r>
+        <w:br/>
+      </w:r>
+      <w:r>
+        <w:br/>
+      </w:r>
+      <w:r>
+        <w:rPr>
+          <w:rStyle w:val="VerbatimChar"/>
+        </w:rPr>
+        <w:t xml:space="preserve">Merge §1+2+3+4 → single Overview page</w:t>
+      </w:r>
+      <w:r>
+        <w:br/>
+      </w:r>
+      <w:r>
+        <w:rPr>
+          <w:rStyle w:val="VerbatimChar"/>
+        </w:rPr>
+        <w:t xml:space="preserve">All four are conceptual background that a reader needs once. Splitting them creates unnecessary navigation hops before they reach actionable content.</w:t>
+      </w:r>
+      <w:r>
+        <w:br/>
+      </w:r>
+      <w:r>
+        <w:br/>
+      </w:r>
+      <w:r>
+        <w:rPr>
+          <w:rStyle w:val="VerbatimChar"/>
+        </w:rPr>
+        <w:t xml:space="preserve">Split §5 (Hardware) from §6 (Software)</w:t>
+      </w:r>
+      <w:r>
+        <w:br/>
+      </w:r>
+      <w:r>
+        <w:rPr>
+          <w:rStyle w:val="VerbatimChar"/>
+        </w:rPr>
+        <w:t xml:space="preserve">Different audiences read these at different times — procurement reads hardware specs in Week 0; the technical team reads software requirements later. Keeping them separate also lets you link directly to hardware-requirements.md from the Infrastructure section.</w:t>
+      </w:r>
+      <w:r>
+        <w:br/>
+      </w:r>
+      <w:r>
+        <w:br/>
+      </w:r>
+      <w:r>
+        <w:rPr>
+          <w:rStyle w:val="VerbatimChar"/>
+        </w:rPr>
+        <w:t xml:space="preserve">Separate §23 (Governance) into Planning, not Go-Live</w:t>
+      </w:r>
+      <w:r>
+        <w:br/>
+      </w:r>
+      <w:r>
+        <w:rPr>
+          <w:rStyle w:val="VerbatimChar"/>
+        </w:rPr>
+        <w:t xml:space="preserve">Governance structure is defined at pilot kick-off, not at go-live. Placing it in Planning aligns with when the reader actually needs it.</w:t>
+      </w:r>
+      <w:r>
+        <w:br/>
+      </w:r>
+      <w:r>
+        <w:br/>
+      </w:r>
+      <w:r>
+        <w:rPr>
+          <w:rStyle w:val="VerbatimChar"/>
+        </w:rPr>
+        <w:t xml:space="preserve">Elevate Appendices to first-class Reference pages</w:t>
+      </w:r>
+      <w:r>
+        <w:br/>
+      </w:r>
+      <w:r>
+        <w:rPr>
+          <w:rStyle w:val="VerbatimChar"/>
+        </w:rPr>
+        <w:t xml:space="preserve">Appendix A (Center Checklist) and Appendix B (Run Sheet) are operationally critical documents. Field supervisors need to link to them directly — not scroll to the bottom of a 2,000-line page. As standalone pages they're also printable and linkable.</w:t>
+      </w:r>
+      <w:r>
+        <w:br/>
+      </w:r>
+      <w:r>
+        <w:br/>
+      </w:r>
+      <w:r>
+        <w:rPr>
+          <w:rStyle w:val="VerbatimChar"/>
+        </w:rPr>
+        <w:t xml:space="preserve">Split "Authentication + Credentials" from "Field Operations"</w:t>
+      </w:r>
+      <w:r>
+        <w:br/>
+      </w:r>
+      <w:r>
+        <w:rPr>
+          <w:rStyle w:val="VerbatimChar"/>
+        </w:rPr>
+        <w:t xml:space="preserve">Sections 12 and 13 (eSignet, INJI Wallet) cover the authentication and credentialing phase of the resident journey — distinct from the registration phase covered in 17/18/19. Keeping them separate clarifies the sequence: register → process → authenticate → issue credential.</w:t>
+      </w:r>
+      <w:r>
+        <w:br/>
+      </w:r>
+      <w:r>
+        <w:br/>
+      </w:r>
+      <w:r>
+        <w:rPr>
+          <w:rStyle w:val="VerbatimChar"/>
+        </w:rPr>
+        <w:t xml:space="preserve">§24 (Critical Success Factors) → Reference, not Closure</w:t>
+      </w:r>
+      <w:r>
+        <w:br/>
+      </w:r>
+      <w:r>
+        <w:rPr>
+          <w:rStyle w:val="VerbatimChar"/>
+        </w:rPr>
+        <w:t xml:space="preserve">A program manager reads this at the start of planning to avoid known pitfalls, and refers back to it throughout. Burying it at §24 (near the end) in the current doc means it's read too late.</w:t>
+      </w:r>
+      <w:r>
+        <w:br/>
+      </w:r>
+      <w:r>
+        <w:br/>
+      </w:r>
+      <w:r>
+        <w:rPr>
+          <w:rStyle w:val="VerbatimChar"/>
+        </w:rPr>
+        <w:t xml:space="preserve">Audience Map (who reads which section)</w:t>
+      </w:r>
+      <w:r>
+        <w:br/>
+      </w:r>
+      <w:r>
+        <w:br/>
+      </w:r>
+      <w:r>
+        <w:rPr>
+          <w:rStyle w:val="VerbatimChar"/>
+        </w:rPr>
+        <w:t xml:space="preserve">┌─────────────────────────────┬──────────────────────────────────────────────────────────────────────────┐</w:t>
+      </w:r>
+      <w:r>
+        <w:br/>
+      </w:r>
+      <w:r>
+        <w:rPr>
+          <w:rStyle w:val="VerbatimChar"/>
+        </w:rPr>
+        <w:t xml:space="preserve">│          Audience           │                       Sections they primarily need                       │</w:t>
+      </w:r>
+      <w:r>
+        <w:br/>
+      </w:r>
+      <w:r>
+        <w:rPr>
+          <w:rStyle w:val="VerbatimChar"/>
+        </w:rPr>
+        <w:t xml:space="preserve">├─────────────────────────────┼──────────────────────────────────────────────────────────────────────────┤</w:t>
+      </w:r>
+      <w:r>
+        <w:br/>
+      </w:r>
+      <w:r>
+        <w:rPr>
+          <w:rStyle w:val="VerbatimChar"/>
+        </w:rPr>
+        <w:t xml:space="preserve">│ Program Manager             │ Overview, Planning, Governance, Critical Success Factors, Closure        │</w:t>
+      </w:r>
+      <w:r>
+        <w:br/>
+      </w:r>
+      <w:r>
+        <w:rPr>
+          <w:rStyle w:val="VerbatimChar"/>
+        </w:rPr>
+        <w:t xml:space="preserve">├─────────────────────────────┼──────────────────────────────────────────────────────────────────────────┤</w:t>
+      </w:r>
+      <w:r>
+        <w:br/>
+      </w:r>
+      <w:r>
+        <w:rPr>
+          <w:rStyle w:val="VerbatimChar"/>
+        </w:rPr>
+        <w:t xml:space="preserve">│ Technical Lead              │ Infrastructure, Platform Readiness, Sandbox Hardening, UAT               │</w:t>
+      </w:r>
+      <w:r>
+        <w:br/>
+      </w:r>
+      <w:r>
+        <w:rPr>
+          <w:rStyle w:val="VerbatimChar"/>
+        </w:rPr>
+        <w:t xml:space="preserve">├─────────────────────────────┼──────────────────────────────────────────────────────────────────────────┤</w:t>
+      </w:r>
+      <w:r>
+        <w:br/>
+      </w:r>
+      <w:r>
+        <w:rPr>
+          <w:rStyle w:val="VerbatimChar"/>
+        </w:rPr>
+        <w:t xml:space="preserve">│ Field Operator / Supervisor │ Registration Center, Registration Workflow, Biometric Capture, Run Sheet │</w:t>
+      </w:r>
+      <w:r>
+        <w:br/>
+      </w:r>
+      <w:r>
+        <w:rPr>
+          <w:rStyle w:val="VerbatimChar"/>
+        </w:rPr>
+        <w:t xml:space="preserve">├─────────────────────────────┼──────────────────────────────────────────────────────────────────────────┤</w:t>
+      </w:r>
+      <w:r>
+        <w:br/>
+      </w:r>
+      <w:r>
+        <w:rPr>
+          <w:rStyle w:val="VerbatimChar"/>
+        </w:rPr>
+        <w:t xml:space="preserve">│ Country Procurement         │ Hardware Requirements, Software Requirements                             │</w:t>
+      </w:r>
+      <w:r>
+        <w:br/>
+      </w:r>
+      <w:r>
+        <w:rPr>
+          <w:rStyle w:val="VerbatimChar"/>
+        </w:rPr>
+        <w:t xml:space="preserve">├─────────────────────────────┼──────────────────────────────────────────────────────────────────────────┤</w:t>
+      </w:r>
+      <w:r>
+        <w:br/>
+      </w:r>
+      <w:r>
+        <w:rPr>
+          <w:rStyle w:val="VerbatimChar"/>
+        </w:rPr>
+        <w:t xml:space="preserve">│ Trainer                     │ Training and Scenarios, Participant Mix                                  │</w:t>
+      </w:r>
+      <w:r>
+        <w:br/>
+      </w:r>
+      <w:r>
+        <w:rPr>
+          <w:rStyle w:val="VerbatimChar"/>
+        </w:rPr>
+        <w:t xml:space="preserve">└─────────────────────────────┴──────────────────────────────────────────────────────────────────────────┘</w:t>
+      </w:r>
+      <w:r>
+        <w:br/>
+      </w:r>
+      <w:r>
+        <w:br/>
+      </w:r>
+      <w:r>
+        <w:rPr>
+          <w:rStyle w:val="VerbatimChar"/>
+        </w:rPr>
+        <w:t xml:space="preserve">This structure lets each audience navigate directly to their section without scrolling through irrelevant content.</w:t>
+      </w:r>
+    </w:p>
+    <w:bookmarkEnd w:id="10"/>
+    <w:bookmarkStart w:id="19" w:name="earlier-toc"/>
+    <w:p>
+      <w:pPr>
+        <w:pStyle w:val="Heading1"/>
+      </w:pPr>
+      <w:r>
+        <w:t xml:space="preserve">Earlier TOC</w:t>
+      </w:r>
+    </w:p>
+    <w:p>
+      <w:pPr>
+        <w:pStyle w:val="FirstParagraph"/>
+      </w:pPr>
+      <w:r>
+        <w:t xml:space="preserve">For merge check</w:t>
+      </w:r>
+      <w:r>
+        <w:t xml:space="preserve"> </w:t>
+      </w:r>
       <w:r>
         <w:t xml:space="preserve">Pilot Cook Book</w:t>
       </w:r>
@@ -370,21 +1330,18 @@
         <w:t xml:space="preserve">Pilot………………………………………………………….</w:t>
       </w:r>
     </w:p>
-    <w:p>
-      <w:pPr>
-        <w:pStyle w:val="BodyText"/>
-      </w:pPr>
-      <w:r>
-        <w:rPr>
-          <w:b/>
-          <w:bCs/>
-        </w:rPr>
-        <w:t xml:space="preserve">1. About this Cook Book</w:t>
-      </w:r>
-    </w:p>
-    <w:p>
-      <w:pPr>
-        <w:pStyle w:val="BodyText"/>
+    <w:bookmarkStart w:id="13" w:name="about-this-functional-pilot-guide"/>
+    <w:p>
+      <w:pPr>
+        <w:pStyle w:val="Heading2"/>
+      </w:pPr>
+      <w:r>
+        <w:t xml:space="preserve">About this Functional Pilot Guide</w:t>
+      </w:r>
+    </w:p>
+    <w:p>
+      <w:pPr>
+        <w:pStyle w:val="FirstParagraph"/>
       </w:pPr>
       <w:r>
         <w:t xml:space="preserve">This cook book is a practical, step-by-step recipe for running a rapid</w:t>
@@ -539,21 +1496,18 @@
         </w:tc>
       </w:tr>
     </w:tbl>
-    <w:p>
-      <w:pPr>
-        <w:pStyle w:val="BodyText"/>
-      </w:pPr>
-      <w:r>
-        <w:rPr>
-          <w:b/>
-          <w:bCs/>
-        </w:rPr>
-        <w:t xml:space="preserve">2. Pilot Objectives</w:t>
-      </w:r>
-    </w:p>
-    <w:p>
-      <w:pPr>
-        <w:pStyle w:val="BodyText"/>
+    <w:bookmarkStart w:id="11" w:name="pilot-objectives"/>
+    <w:p>
+      <w:pPr>
+        <w:pStyle w:val="Heading3"/>
+      </w:pPr>
+      <w:r>
+        <w:t xml:space="preserve">Pilot Objectives**</w:t>
+      </w:r>
+    </w:p>
+    <w:p>
+      <w:pPr>
+        <w:pStyle w:val="FirstParagraph"/>
       </w:pPr>
       <w:r>
         <w:t xml:space="preserve">The pilot is a hands-on, end-to-end functional run-through of MOSIP. It</w:t>
@@ -577,16 +1531,13 @@
         <w:t xml:space="preserve">questions the country will face at national rollout.</w:t>
       </w:r>
     </w:p>
-    <w:bookmarkStart w:id="9" w:name="primary-objectives"/>
-    <w:p>
-      <w:pPr>
-        <w:pStyle w:val="Heading2"/>
-      </w:pPr>
-      <w:r>
-        <w:rPr>
-          <w:b/>
-          <w:bCs/>
-        </w:rPr>
+    <w:bookmarkEnd w:id="11"/>
+    <w:bookmarkStart w:id="12" w:name="primary-objectives"/>
+    <w:p>
+      <w:pPr>
+        <w:pStyle w:val="Heading3"/>
+      </w:pPr>
+      <w:r>
         <w:t xml:space="preserve">Primary objectives</w:t>
       </w:r>
     </w:p>
@@ -721,8 +1672,9 @@
         <w:t xml:space="preserve">decisions that must be addressed before scale.</w:t>
       </w:r>
     </w:p>
-    <w:bookmarkEnd w:id="9"/>
-    <w:bookmarkStart w:id="10" w:name="out-of-scope-for-the-pilot"/>
+    <w:bookmarkEnd w:id="12"/>
+    <w:bookmarkEnd w:id="13"/>
+    <w:bookmarkStart w:id="14" w:name="out-of-scope-for-the-pilot"/>
     <w:p>
       <w:pPr>
         <w:pStyle w:val="Heading2"/>
@@ -865,29 +1817,22 @@
         </w:tc>
       </w:tr>
     </w:tbl>
-    <w:p>
-      <w:pPr>
-        <w:pStyle w:val="BodyText"/>
-      </w:pPr>
-      <w:r>
-        <w:rPr>
-          <w:b/>
-          <w:bCs/>
-        </w:rPr>
-        <w:t xml:space="preserve">3. Scope and Assumptions</w:t>
-      </w:r>
-    </w:p>
-    <w:bookmarkEnd w:id="10"/>
-    <w:bookmarkStart w:id="11" w:name="in-scope"/>
+    <w:bookmarkEnd w:id="14"/>
+    <w:bookmarkStart w:id="17" w:name="scope-and-assumptions"/>
     <w:p>
       <w:pPr>
         <w:pStyle w:val="Heading2"/>
       </w:pPr>
       <w:r>
-        <w:rPr>
-          <w:b/>
-          <w:bCs/>
-        </w:rPr>
+        <w:t xml:space="preserve">Scope and Assumptions</w:t>
+      </w:r>
+    </w:p>
+    <w:bookmarkStart w:id="15" w:name="in-scope"/>
+    <w:p>
+      <w:pPr>
+        <w:pStyle w:val="Heading3"/>
+      </w:pPr>
+      <w:r>
         <w:t xml:space="preserve">In scope</w:t>
       </w:r>
     </w:p>
@@ -1024,17 +1969,13 @@
         <w:t xml:space="preserve">Functional training for the country team during the pilot.</w:t>
       </w:r>
     </w:p>
-    <w:bookmarkEnd w:id="11"/>
-    <w:bookmarkStart w:id="12" w:name="key-assumptions"/>
-    <w:p>
-      <w:pPr>
-        <w:pStyle w:val="Heading2"/>
-      </w:pPr>
-      <w:r>
-        <w:rPr>
-          <w:b/>
-          <w:bCs/>
-        </w:rPr>
+    <w:bookmarkEnd w:id="15"/>
+    <w:bookmarkStart w:id="16" w:name="key-assumptions"/>
+    <w:p>
+      <w:pPr>
+        <w:pStyle w:val="Heading3"/>
+      </w:pPr>
+      <w:r>
         <w:t xml:space="preserve">Key assumptions</w:t>
       </w:r>
     </w:p>
@@ -1231,21 +2172,20 @@
         </w:tc>
       </w:tr>
     </w:tbl>
-    <w:p>
-      <w:pPr>
-        <w:pStyle w:val="BodyText"/>
-      </w:pPr>
-      <w:r>
-        <w:rPr>
-          <w:b/>
-          <w:bCs/>
-        </w:rPr>
-        <w:t xml:space="preserve">4. Pilot Lifecycle at a Glance</w:t>
-      </w:r>
-    </w:p>
-    <w:p>
-      <w:pPr>
-        <w:pStyle w:val="BodyText"/>
+    <w:bookmarkEnd w:id="16"/>
+    <w:bookmarkEnd w:id="17"/>
+    <w:bookmarkStart w:id="18" w:name="pilot-lifecycle-at-a-glance"/>
+    <w:p>
+      <w:pPr>
+        <w:pStyle w:val="Heading2"/>
+      </w:pPr>
+      <w:r>
+        <w:t xml:space="preserve">Pilot Lifecycle at a Glance</w:t>
+      </w:r>
+    </w:p>
+    <w:p>
+      <w:pPr>
+        <w:pStyle w:val="FirstParagraph"/>
       </w:pPr>
       <w:r>
         <w:t xml:space="preserve">The pilot moves through eight overlapping stages. The lifecycle is</w:t>
@@ -1937,21 +2877,20 @@
         </w:tc>
       </w:tr>
     </w:tbl>
-    <w:p>
-      <w:pPr>
-        <w:pStyle w:val="BodyText"/>
-      </w:pPr>
-      <w:r>
-        <w:rPr>
-          <w:b/>
-          <w:bCs/>
-        </w:rPr>
-        <w:t xml:space="preserve">5. Hardware Specifications and Requirements</w:t>
-      </w:r>
-    </w:p>
-    <w:p>
-      <w:pPr>
-        <w:pStyle w:val="BodyText"/>
+    <w:bookmarkEnd w:id="18"/>
+    <w:bookmarkEnd w:id="19"/>
+    <w:bookmarkStart w:id="29" w:name="hardware-specifications-and-requirements"/>
+    <w:p>
+      <w:pPr>
+        <w:pStyle w:val="Heading1"/>
+      </w:pPr>
+      <w:r>
+        <w:t xml:space="preserve">Hardware Specifications and Requirements</w:t>
+      </w:r>
+    </w:p>
+    <w:p>
+      <w:pPr>
+        <w:pStyle w:val="FirstParagraph"/>
       </w:pPr>
       <w:r>
         <w:t xml:space="preserve">MOSIP supplies the full hardware specification for the pilot so that the</w:t>
@@ -1969,19 +2908,13 @@
         <w:t xml:space="preserve">minimum footprint to run the pilot end to end.</w:t>
       </w:r>
     </w:p>
-    <w:bookmarkEnd w:id="12"/>
-    <w:bookmarkEnd w:id="13"/>
-    <w:bookmarkStart w:id="14" w:name="server-and-infrastructure-footprint"/>
-    <w:p>
-      <w:pPr>
-        <w:pStyle w:val="Heading1"/>
-      </w:pPr>
-      <w:r>
-        <w:rPr>
-          <w:b/>
-          <w:bCs/>
-        </w:rPr>
-        <w:t xml:space="preserve">5.1 Server and infrastructure footprint</w:t>
+    <w:bookmarkStart w:id="21" w:name="server-and-infrastructure-footprint"/>
+    <w:p>
+      <w:pPr>
+        <w:pStyle w:val="Heading2"/>
+      </w:pPr>
+      <w:r>
+        <w:t xml:space="preserve">Server and infrastructure footprint</w:t>
       </w:r>
     </w:p>
     <w:p>
@@ -3350,16 +4283,13 @@
         </w:tc>
       </w:tr>
     </w:tbl>
-    <w:p>
-      <w:pPr>
-        <w:pStyle w:val="BodyText"/>
-      </w:pPr>
-      <w:r>
-        <w:rPr>
-          <w:b/>
-          <w:bCs/>
-        </w:rPr>
-        <w:t xml:space="preserve">Aggregate footprint:</w:t>
+    <w:bookmarkStart w:id="20" w:name="aggregate-footprint"/>
+    <w:p>
+      <w:pPr>
+        <w:pStyle w:val="Heading3"/>
+      </w:pPr>
+      <w:r>
+        <w:t xml:space="preserve">Aggregate footprint</w:t>
       </w:r>
     </w:p>
     <w:p>
@@ -3485,18 +4415,15 @@
         </w:tc>
       </w:tr>
     </w:tbl>
-    <w:bookmarkEnd w:id="14"/>
-    <w:bookmarkStart w:id="15" w:name="registration-kit-laptop-specification"/>
-    <w:p>
-      <w:pPr>
-        <w:pStyle w:val="Heading1"/>
-      </w:pPr>
-      <w:r>
-        <w:rPr>
-          <w:b/>
-          <w:bCs/>
-        </w:rPr>
-        <w:t xml:space="preserve">5.2 Registration kit – laptop specification</w:t>
+    <w:bookmarkEnd w:id="20"/>
+    <w:bookmarkEnd w:id="21"/>
+    <w:bookmarkStart w:id="22" w:name="registration-kit-laptop-specification"/>
+    <w:p>
+      <w:pPr>
+        <w:pStyle w:val="Heading2"/>
+      </w:pPr>
+      <w:r>
+        <w:t xml:space="preserve">Registration kit – laptop specification</w:t>
       </w:r>
     </w:p>
     <w:tbl>
@@ -3856,18 +4783,14 @@
         </w:tc>
       </w:tr>
     </w:tbl>
-    <w:bookmarkEnd w:id="15"/>
-    <w:bookmarkStart w:id="16" w:name="X2f0aad2e20569937bb930daf0463dfca1b7779e"/>
-    <w:p>
-      <w:pPr>
-        <w:pStyle w:val="Heading1"/>
-      </w:pPr>
-      <w:r>
-        <w:rPr>
-          <w:b/>
-          <w:bCs/>
-        </w:rPr>
-        <w:t xml:space="preserve">5.3 Biometric devices and authentication devices</w:t>
+    <w:bookmarkEnd w:id="22"/>
+    <w:bookmarkStart w:id="23" w:name="X2f0aad2e20569937bb930daf0463dfca1b7779e"/>
+    <w:p>
+      <w:pPr>
+        <w:pStyle w:val="Heading2"/>
+      </w:pPr>
+      <w:r>
+        <w:t xml:space="preserve">Biometric devices and authentication devices</w:t>
       </w:r>
     </w:p>
     <w:tbl>
@@ -4224,37 +5147,22 @@
         </w:tc>
       </w:tr>
     </w:tbl>
-    <w:p>
-      <w:r>
-        <w:pict>
-          <v:rect style="width:0;height:1.5pt" o:hralign="center" o:hrstd="t" o:hr="t"/>
-        </w:pict>
-      </w:r>
-    </w:p>
-    <w:bookmarkEnd w:id="16"/>
-    <w:bookmarkStart w:id="19" w:name="Xfb43aa0218d6de2c0c9026e138fdb1ccb45cd5d"/>
-    <w:p>
-      <w:pPr>
-        <w:pStyle w:val="Heading1"/>
-      </w:pPr>
-      <w:r>
-        <w:rPr>
-          <w:b/>
-          <w:bCs/>
-        </w:rPr>
-        <w:t xml:space="preserve">5.4 Document scanners, printers and photo booths</w:t>
-      </w:r>
-    </w:p>
-    <w:bookmarkStart w:id="17" w:name="X28b81c68bcb2850435804168d35fce125ece7e2"/>
+    <w:bookmarkEnd w:id="23"/>
+    <w:bookmarkStart w:id="26" w:name="Xfb43aa0218d6de2c0c9026e138fdb1ccb45cd5d"/>
     <w:p>
       <w:pPr>
         <w:pStyle w:val="Heading2"/>
       </w:pPr>
       <w:r>
-        <w:rPr>
-          <w:b/>
-          <w:bCs/>
-        </w:rPr>
+        <w:t xml:space="preserve">Document scanners, printers and photo booths</w:t>
+      </w:r>
+    </w:p>
+    <w:bookmarkStart w:id="24" w:name="X28b81c68bcb2850435804168d35fce125ece7e2"/>
+    <w:p>
+      <w:pPr>
+        <w:pStyle w:val="Heading3"/>
+      </w:pPr>
+      <w:r>
         <w:t xml:space="preserve">Printer with scanner (per registration station)</w:t>
       </w:r>
     </w:p>
@@ -4530,17 +5438,13 @@
         </w:tc>
       </w:tr>
     </w:tbl>
-    <w:bookmarkEnd w:id="17"/>
-    <w:bookmarkStart w:id="18" w:name="photo-booth-per-registration-station"/>
-    <w:p>
-      <w:pPr>
-        <w:pStyle w:val="Heading2"/>
-      </w:pPr>
-      <w:r>
-        <w:rPr>
-          <w:b/>
-          <w:bCs/>
-        </w:rPr>
+    <w:bookmarkEnd w:id="24"/>
+    <w:bookmarkStart w:id="25" w:name="photo-booth-per-registration-station"/>
+    <w:p>
+      <w:pPr>
+        <w:pStyle w:val="Heading3"/>
+      </w:pPr>
+      <w:r>
         <w:t xml:space="preserve">Photo booth (per registration station)</w:t>
       </w:r>
     </w:p>
@@ -4695,19 +5599,15 @@
         </w:tc>
       </w:tr>
     </w:tbl>
-    <w:bookmarkEnd w:id="18"/>
-    <w:bookmarkEnd w:id="19"/>
-    <w:bookmarkStart w:id="20" w:name="mobile-phones-for-inji-wallet"/>
-    <w:p>
-      <w:pPr>
-        <w:pStyle w:val="Heading1"/>
-      </w:pPr>
-      <w:r>
-        <w:rPr>
-          <w:b/>
-          <w:bCs/>
-        </w:rPr>
-        <w:t xml:space="preserve">5.5 Mobile phones for INJI Wallet</w:t>
+    <w:bookmarkEnd w:id="25"/>
+    <w:bookmarkEnd w:id="26"/>
+    <w:bookmarkStart w:id="27" w:name="mobile-phones-for-inji-wallet"/>
+    <w:p>
+      <w:pPr>
+        <w:pStyle w:val="Heading2"/>
+      </w:pPr>
+      <w:r>
+        <w:t xml:space="preserve">Mobile phones for INJI Wallet</w:t>
       </w:r>
     </w:p>
     <w:p>
@@ -4746,18 +5646,14 @@
         <w:t xml:space="preserve">Approximately 10 iPhones (iPhone 12 or above)</w:t>
       </w:r>
     </w:p>
-    <w:bookmarkEnd w:id="20"/>
-    <w:bookmarkStart w:id="76" w:name="Xafc5c611fd644461bfba27bfa4f0720caa0c90a"/>
-    <w:p>
-      <w:pPr>
-        <w:pStyle w:val="Heading1"/>
-      </w:pPr>
-      <w:r>
-        <w:rPr>
-          <w:b/>
-          <w:bCs/>
-        </w:rPr>
-        <w:t xml:space="preserve">5.6 Helpdesk, administration and adjudication terminals</w:t>
+    <w:bookmarkEnd w:id="27"/>
+    <w:bookmarkStart w:id="28" w:name="Xafc5c611fd644461bfba27bfa4f0720caa0c90a"/>
+    <w:p>
+      <w:pPr>
+        <w:pStyle w:val="Heading2"/>
+      </w:pPr>
+      <w:r>
+        <w:t xml:space="preserve">Helpdesk, administration and adjudication terminals**</w:t>
       </w:r>
     </w:p>
     <w:tbl>
@@ -5130,21 +6026,20 @@
         </w:tc>
       </w:tr>
     </w:tbl>
-    <w:p>
-      <w:pPr>
-        <w:pStyle w:val="BodyText"/>
-      </w:pPr>
-      <w:r>
-        <w:rPr>
-          <w:b/>
-          <w:bCs/>
-        </w:rPr>
-        <w:t xml:space="preserve">6. Software and Platform Requirements</w:t>
-      </w:r>
-    </w:p>
-    <w:p>
-      <w:pPr>
-        <w:pStyle w:val="BodyText"/>
+    <w:bookmarkEnd w:id="28"/>
+    <w:bookmarkEnd w:id="29"/>
+    <w:bookmarkStart w:id="30" w:name="software-and-platform-requirements"/>
+    <w:p>
+      <w:pPr>
+        <w:pStyle w:val="Heading1"/>
+      </w:pPr>
+      <w:r>
+        <w:t xml:space="preserve">Software and Platform Requirements</w:t>
+      </w:r>
+    </w:p>
+    <w:p>
+      <w:pPr>
+        <w:pStyle w:val="FirstParagraph"/>
       </w:pPr>
       <w:r>
         <w:t xml:space="preserve">MOSIP supplies the platform and integrates the third-party components.</w:t>
@@ -5853,21 +6748,19 @@
         </w:tc>
       </w:tr>
     </w:tbl>
-    <w:p>
-      <w:pPr>
-        <w:pStyle w:val="BodyText"/>
-      </w:pPr>
-      <w:r>
-        <w:rPr>
-          <w:b/>
-          <w:bCs/>
-        </w:rPr>
-        <w:t xml:space="preserve">7. Project Execution Plan (Week-by-Week)</w:t>
-      </w:r>
-    </w:p>
-    <w:p>
-      <w:pPr>
-        <w:pStyle w:val="BodyText"/>
+    <w:bookmarkEnd w:id="30"/>
+    <w:bookmarkStart w:id="32" w:name="project-execution-plan-week-by-week"/>
+    <w:p>
+      <w:pPr>
+        <w:pStyle w:val="Heading1"/>
+      </w:pPr>
+      <w:r>
+        <w:t xml:space="preserve">Project Execution Plan (Week-by-Week)</w:t>
+      </w:r>
+    </w:p>
+    <w:p>
+      <w:pPr>
+        <w:pStyle w:val="FirstParagraph"/>
       </w:pPr>
       <w:r>
         <w:t xml:space="preserve">The plan below compresses the pilot into approximately 14 weeks.</w:t>
@@ -6665,16 +7558,12 @@
         </w:tc>
       </w:tr>
     </w:tbl>
-    <w:bookmarkStart w:id="21" w:name="critical-dependencies"/>
+    <w:bookmarkStart w:id="31" w:name="critical-dependencies"/>
     <w:p>
       <w:pPr>
         <w:pStyle w:val="Heading2"/>
       </w:pPr>
       <w:r>
-        <w:rPr>
-          <w:b/>
-          <w:bCs/>
-        </w:rPr>
         <w:t xml:space="preserve">Critical dependencies</w:t>
       </w:r>
     </w:p>
@@ -6842,21 +7731,20 @@
         <w:t xml:space="preserve">(orange).</w:t>
       </w:r>
     </w:p>
-    <w:p>
-      <w:pPr>
-        <w:pStyle w:val="BodyText"/>
-      </w:pPr>
-      <w:r>
-        <w:rPr>
-          <w:b/>
-          <w:bCs/>
-        </w:rPr>
-        <w:t xml:space="preserve">8. Roles and Responsibilities</w:t>
-      </w:r>
-    </w:p>
-    <w:p>
-      <w:pPr>
-        <w:pStyle w:val="BodyText"/>
+    <w:bookmarkEnd w:id="31"/>
+    <w:bookmarkEnd w:id="32"/>
+    <w:bookmarkStart w:id="33" w:name="roles-and-responsibilities"/>
+    <w:p>
+      <w:pPr>
+        <w:pStyle w:val="Heading1"/>
+      </w:pPr>
+      <w:r>
+        <w:t xml:space="preserve">Roles and Responsibilities</w:t>
+      </w:r>
+    </w:p>
+    <w:p>
+      <w:pPr>
+        <w:pStyle w:val="FirstParagraph"/>
       </w:pPr>
       <w:r>
         <w:t xml:space="preserve">Responsibilities are split between the country program and the MOSIP</w:t>
@@ -7906,21 +8794,19 @@
         </w:tc>
       </w:tr>
     </w:tbl>
-    <w:p>
-      <w:pPr>
-        <w:pStyle w:val="BodyText"/>
-      </w:pPr>
-      <w:r>
-        <w:rPr>
-          <w:b/>
-          <w:bCs/>
-        </w:rPr>
-        <w:t xml:space="preserve">9. Resourcing the Country Team</w:t>
-      </w:r>
-    </w:p>
-    <w:p>
-      <w:pPr>
-        <w:pStyle w:val="BodyText"/>
+    <w:bookmarkEnd w:id="33"/>
+    <w:bookmarkStart w:id="34" w:name="resourcing-the-country-team"/>
+    <w:p>
+      <w:pPr>
+        <w:pStyle w:val="Heading1"/>
+      </w:pPr>
+      <w:r>
+        <w:t xml:space="preserve">Resourcing the Country Team</w:t>
+      </w:r>
+    </w:p>
+    <w:p>
+      <w:pPr>
+        <w:pStyle w:val="FirstParagraph"/>
       </w:pPr>
       <w:r>
         <w:t xml:space="preserve">The country team is the Center of gravity of the pilot. They run the</w:t>
@@ -8466,21 +9352,19 @@
         </w:tc>
       </w:tr>
     </w:tbl>
-    <w:p>
-      <w:pPr>
-        <w:pStyle w:val="BodyText"/>
-      </w:pPr>
-      <w:r>
-        <w:rPr>
-          <w:b/>
-          <w:bCs/>
-        </w:rPr>
-        <w:t xml:space="preserve">10. Designing the Participant Mix</w:t>
-      </w:r>
-    </w:p>
-    <w:p>
-      <w:pPr>
-        <w:pStyle w:val="BodyText"/>
+    <w:bookmarkEnd w:id="34"/>
+    <w:bookmarkStart w:id="36" w:name="designing-the-participant-mix"/>
+    <w:p>
+      <w:pPr>
+        <w:pStyle w:val="Heading1"/>
+      </w:pPr>
+      <w:r>
+        <w:t xml:space="preserve">Designing the Participant Mix</w:t>
+      </w:r>
+    </w:p>
+    <w:p>
+      <w:pPr>
+        <w:pStyle w:val="FirstParagraph"/>
       </w:pPr>
       <w:r>
         <w:t xml:space="preserve">The point of the pilot is to feel what MOSIP behaves like for real</w:t>
@@ -8504,17 +9388,12 @@
         <w:t xml:space="preserve">inclusion of harder edge cases.</w:t>
       </w:r>
     </w:p>
-    <w:bookmarkEnd w:id="21"/>
-    <w:bookmarkStart w:id="22" w:name="recommended-demographic-distribution"/>
+    <w:bookmarkStart w:id="35" w:name="recommended-demographic-distribution"/>
     <w:p>
       <w:pPr>
         <w:pStyle w:val="Heading2"/>
       </w:pPr>
       <w:r>
-        <w:rPr>
-          <w:b/>
-          <w:bCs/>
-        </w:rPr>
         <w:t xml:space="preserve">Recommended demographic distribution</w:t>
       </w:r>
     </w:p>
@@ -9124,21 +10003,20 @@
         </w:tc>
       </w:tr>
     </w:tbl>
-    <w:p>
-      <w:pPr>
-        <w:pStyle w:val="BodyText"/>
-      </w:pPr>
-      <w:r>
-        <w:rPr>
-          <w:b/>
-          <w:bCs/>
-        </w:rPr>
-        <w:t xml:space="preserve">11. Online and Offline Registration</w:t>
-      </w:r>
-    </w:p>
-    <w:p>
-      <w:pPr>
-        <w:pStyle w:val="BodyText"/>
+    <w:bookmarkEnd w:id="35"/>
+    <w:bookmarkEnd w:id="36"/>
+    <w:bookmarkStart w:id="39" w:name="online-and-offline-registration"/>
+    <w:p>
+      <w:pPr>
+        <w:pStyle w:val="Heading1"/>
+      </w:pPr>
+      <w:r>
+        <w:t xml:space="preserve">Online and Offline Registration</w:t>
+      </w:r>
+    </w:p>
+    <w:p>
+      <w:pPr>
+        <w:pStyle w:val="FirstParagraph"/>
       </w:pPr>
       <w:r>
         <w:t xml:space="preserve">MOSIP supports registration in both connected (online) and disconnected</w:t>
@@ -9156,17 +10034,12 @@
         <w:t xml:space="preserve">understands the trade-offs before national rollout.</w:t>
       </w:r>
     </w:p>
-    <w:bookmarkEnd w:id="22"/>
-    <w:bookmarkStart w:id="23" w:name="online-registration"/>
+    <w:bookmarkStart w:id="37" w:name="online-registration"/>
     <w:p>
       <w:pPr>
         <w:pStyle w:val="Heading2"/>
       </w:pPr>
       <w:r>
-        <w:rPr>
-          <w:b/>
-          <w:bCs/>
-        </w:rPr>
         <w:t xml:space="preserve">Online registration</w:t>
       </w:r>
     </w:p>
@@ -9221,17 +10094,13 @@
         <w:t xml:space="preserve">duration of the registration window.</w:t>
       </w:r>
     </w:p>
-    <w:bookmarkEnd w:id="23"/>
-    <w:bookmarkStart w:id="24" w:name="offline-registration"/>
+    <w:bookmarkEnd w:id="37"/>
+    <w:bookmarkStart w:id="38" w:name="offline-registration"/>
     <w:p>
       <w:pPr>
         <w:pStyle w:val="Heading2"/>
       </w:pPr>
       <w:r>
-        <w:rPr>
-          <w:b/>
-          <w:bCs/>
-        </w:rPr>
         <w:t xml:space="preserve">Offline registration</w:t>
       </w:r>
     </w:p>
@@ -9343,21 +10212,20 @@
         </w:tc>
       </w:tr>
     </w:tbl>
-    <w:p>
-      <w:pPr>
-        <w:pStyle w:val="BodyText"/>
-      </w:pPr>
-      <w:r>
-        <w:rPr>
-          <w:b/>
-          <w:bCs/>
-        </w:rPr>
-        <w:t xml:space="preserve">12. Authentication with eSignet (OTP and Biometrics)</w:t>
-      </w:r>
-    </w:p>
-    <w:p>
-      <w:pPr>
-        <w:pStyle w:val="BodyText"/>
+    <w:bookmarkEnd w:id="38"/>
+    <w:bookmarkEnd w:id="39"/>
+    <w:bookmarkStart w:id="42" w:name="Xb7e2150066a22f134ddf7255e59a481cb1846bf"/>
+    <w:p>
+      <w:pPr>
+        <w:pStyle w:val="Heading1"/>
+      </w:pPr>
+      <w:r>
+        <w:t xml:space="preserve">Authentication with eSignet (OTP and Biometrics)</w:t>
+      </w:r>
+    </w:p>
+    <w:p>
+      <w:pPr>
+        <w:pStyle w:val="FirstParagraph"/>
       </w:pPr>
       <w:r>
         <w:t xml:space="preserve">eSignet is the authentication front door for residents. The pilot uses a</w:t>
@@ -9375,17 +10243,12 @@
         <w:t xml:space="preserve">bundled with eSignet to demonstrate authentication flows end to end.</w:t>
       </w:r>
     </w:p>
-    <w:bookmarkEnd w:id="24"/>
-    <w:bookmarkStart w:id="25" w:name="otp-authentication"/>
+    <w:bookmarkStart w:id="40" w:name="otp-authentication"/>
     <w:p>
       <w:pPr>
         <w:pStyle w:val="Heading2"/>
       </w:pPr>
       <w:r>
-        <w:rPr>
-          <w:b/>
-          <w:bCs/>
-        </w:rPr>
         <w:t xml:space="preserve">OTP authentication</w:t>
       </w:r>
     </w:p>
@@ -9462,17 +10325,13 @@
         <w:t xml:space="preserve">demo service.</w:t>
       </w:r>
     </w:p>
-    <w:bookmarkEnd w:id="25"/>
-    <w:bookmarkStart w:id="26" w:name="biometric-authentication"/>
+    <w:bookmarkEnd w:id="40"/>
+    <w:bookmarkStart w:id="41" w:name="biometric-authentication"/>
     <w:p>
       <w:pPr>
         <w:pStyle w:val="Heading2"/>
       </w:pPr>
       <w:r>
-        <w:rPr>
-          <w:b/>
-          <w:bCs/>
-        </w:rPr>
         <w:t xml:space="preserve">Biometric authentication</w:t>
       </w:r>
     </w:p>
@@ -9612,21 +10471,20 @@
         </w:tc>
       </w:tr>
     </w:tbl>
-    <w:p>
-      <w:pPr>
-        <w:pStyle w:val="BodyText"/>
-      </w:pPr>
-      <w:r>
-        <w:rPr>
-          <w:b/>
-          <w:bCs/>
-        </w:rPr>
-        <w:t xml:space="preserve">13. Issuing and Using INJI Wallet</w:t>
-      </w:r>
-    </w:p>
-    <w:p>
-      <w:pPr>
-        <w:pStyle w:val="BodyText"/>
+    <w:bookmarkEnd w:id="41"/>
+    <w:bookmarkEnd w:id="42"/>
+    <w:bookmarkStart w:id="45" w:name="issuing-and-using-inji-wallet"/>
+    <w:p>
+      <w:pPr>
+        <w:pStyle w:val="Heading1"/>
+      </w:pPr>
+      <w:r>
+        <w:t xml:space="preserve">Issuing and Using INJI Wallet</w:t>
+      </w:r>
+    </w:p>
+    <w:p>
+      <w:pPr>
+        <w:pStyle w:val="FirstParagraph"/>
       </w:pPr>
       <w:r>
         <w:t xml:space="preserve">INJI Wallet is the resident-side companion to MOSIP. It allows the</w:t>
@@ -9650,17 +10508,12 @@
         <w:t xml:space="preserve">process. The pilot exercises both INJI Wallet (mobile) and INJI Web.</w:t>
       </w:r>
     </w:p>
-    <w:bookmarkEnd w:id="26"/>
-    <w:bookmarkStart w:id="27" w:name="method"/>
+    <w:bookmarkStart w:id="43" w:name="method"/>
     <w:p>
       <w:pPr>
         <w:pStyle w:val="Heading2"/>
       </w:pPr>
       <w:r>
-        <w:rPr>
-          <w:b/>
-          <w:bCs/>
-        </w:rPr>
         <w:t xml:space="preserve">Method</w:t>
       </w:r>
     </w:p>
@@ -9726,17 +10579,13 @@
         <w:t xml:space="preserve">verifies the credential cryptographically and grants the demo service.</w:t>
       </w:r>
     </w:p>
-    <w:bookmarkEnd w:id="27"/>
-    <w:bookmarkStart w:id="28" w:name="edge-cases-worth-rehearsing"/>
+    <w:bookmarkEnd w:id="43"/>
+    <w:bookmarkStart w:id="44" w:name="edge-cases-worth-rehearsing"/>
     <w:p>
       <w:pPr>
         <w:pStyle w:val="Heading2"/>
       </w:pPr>
       <w:r>
-        <w:rPr>
-          <w:b/>
-          <w:bCs/>
-        </w:rPr>
         <w:t xml:space="preserve">Edge cases worth rehearsing</w:t>
       </w:r>
     </w:p>
@@ -9779,23 +10628,22 @@
         <w:t xml:space="preserve">the Relying Party.</w:t>
       </w:r>
     </w:p>
+    <w:bookmarkEnd w:id="44"/>
+    <w:bookmarkEnd w:id="45"/>
+    <w:bookmarkStart w:id="48" w:name="Xa0589d76bf9d77412e401002adbcdd4347ed687"/>
+    <w:p>
+      <w:pPr>
+        <w:pStyle w:val="Heading1"/>
+      </w:pPr>
+      <w:r>
+        <w:t xml:space="preserve">Functional Training and Real-Life Scenarios</w:t>
+      </w:r>
+    </w:p>
     <w:p>
       <w:pPr>
         <w:pStyle w:val="FirstParagraph"/>
       </w:pPr>
       <w:r>
-        <w:rPr>
-          <w:b/>
-          <w:bCs/>
-        </w:rPr>
-        <w:t xml:space="preserve">14. Functional Training and Real-Life Scenarios</w:t>
-      </w:r>
-    </w:p>
-    <w:p>
-      <w:pPr>
-        <w:pStyle w:val="BodyText"/>
-      </w:pPr>
-      <w:r>
         <w:t xml:space="preserve">Training is the heart of the pilot. The country team is functionally</w:t>
       </w:r>
       <w:r>
@@ -9811,17 +10659,12 @@
         <w:t xml:space="preserve">examples during the pilot and how to deal with them.</w:t>
       </w:r>
     </w:p>
-    <w:bookmarkEnd w:id="28"/>
-    <w:bookmarkStart w:id="29" w:name="training-streams"/>
+    <w:bookmarkStart w:id="46" w:name="training-streams"/>
     <w:p>
       <w:pPr>
         <w:pStyle w:val="Heading2"/>
       </w:pPr>
       <w:r>
-        <w:rPr>
-          <w:b/>
-          <w:bCs/>
-        </w:rPr>
         <w:t xml:space="preserve">Training streams</w:t>
       </w:r>
     </w:p>
@@ -10237,24 +11080,13 @@
         </w:tc>
       </w:tr>
     </w:tbl>
-    <w:bookmarkEnd w:id="29"/>
-    <w:bookmarkStart w:id="30" w:name="section"/>
+    <w:bookmarkEnd w:id="46"/>
+    <w:bookmarkStart w:id="47" w:name="real-life-scenarios-to-walk-through"/>
     <w:p>
       <w:pPr>
         <w:pStyle w:val="Heading2"/>
       </w:pPr>
-    </w:p>
-    <w:bookmarkEnd w:id="30"/>
-    <w:bookmarkStart w:id="31" w:name="real-life-scenarios-to-walk-through"/>
-    <w:p>
-      <w:pPr>
-        <w:pStyle w:val="Heading2"/>
-      </w:pPr>
-      <w:r>
-        <w:rPr>
-          <w:b/>
-          <w:bCs/>
-        </w:rPr>
+      <w:r>
         <w:t xml:space="preserve">Real-life scenarios to walk through</w:t>
       </w:r>
     </w:p>
@@ -10445,21 +11277,20 @@
         </w:tc>
       </w:tr>
     </w:tbl>
-    <w:p>
-      <w:pPr>
-        <w:pStyle w:val="BodyText"/>
-      </w:pPr>
-      <w:r>
-        <w:rPr>
-          <w:b/>
-          <w:bCs/>
-        </w:rPr>
-        <w:t xml:space="preserve">15. Platform Readiness — Functional Capabilities to Verify</w:t>
-      </w:r>
-    </w:p>
-    <w:p>
-      <w:pPr>
-        <w:pStyle w:val="BodyText"/>
+    <w:bookmarkEnd w:id="47"/>
+    <w:bookmarkEnd w:id="48"/>
+    <w:bookmarkStart w:id="53" w:name="X7d2f4e920b28edcde37d67984ab58069770eb44"/>
+    <w:p>
+      <w:pPr>
+        <w:pStyle w:val="Heading1"/>
+      </w:pPr>
+      <w:r>
+        <w:t xml:space="preserve">Platform Readiness — Functional Capabilities to Verify</w:t>
+      </w:r>
+    </w:p>
+    <w:p>
+      <w:pPr>
+        <w:pStyle w:val="FirstParagraph"/>
       </w:pPr>
       <w:r>
         <w:t xml:space="preserve">Before the country team puts a real resident in front of the</w:t>
@@ -10495,17 +11326,12 @@
         <w:t xml:space="preserve">every flow the pilot will hit has been seen working at least once.</w:t>
       </w:r>
     </w:p>
-    <w:bookmarkEnd w:id="31"/>
-    <w:bookmarkStart w:id="32" w:name="pre-registration-and-registration-flows"/>
+    <w:bookmarkStart w:id="49" w:name="pre-registration-and-registration-flows"/>
     <w:p>
       <w:pPr>
         <w:pStyle w:val="Heading2"/>
       </w:pPr>
       <w:r>
-        <w:rPr>
-          <w:b/>
-          <w:bCs/>
-        </w:rPr>
         <w:t xml:space="preserve">Pre-registration and registration flows</w:t>
       </w:r>
     </w:p>
@@ -10587,17 +11413,13 @@
         <w:t xml:space="preserve">Biometric correction for an in-flight registration.</w:t>
       </w:r>
     </w:p>
-    <w:bookmarkEnd w:id="32"/>
-    <w:bookmarkStart w:id="33" w:name="id-processing-and-issuance"/>
+    <w:bookmarkEnd w:id="49"/>
+    <w:bookmarkStart w:id="50" w:name="id-processing-and-issuance"/>
     <w:p>
       <w:pPr>
         <w:pStyle w:val="Heading2"/>
       </w:pPr>
       <w:r>
-        <w:rPr>
-          <w:b/>
-          <w:bCs/>
-        </w:rPr>
         <w:t xml:space="preserve">ID processing and issuance</w:t>
       </w:r>
     </w:p>
@@ -10678,17 +11500,13 @@
         <w:t xml:space="preserve">Lost ID re-issuance flow.</w:t>
       </w:r>
     </w:p>
-    <w:bookmarkEnd w:id="33"/>
-    <w:bookmarkStart w:id="34" w:name="authentication-and-notifications"/>
+    <w:bookmarkEnd w:id="50"/>
+    <w:bookmarkStart w:id="51" w:name="authentication-and-notifications"/>
     <w:p>
       <w:pPr>
         <w:pStyle w:val="Heading2"/>
       </w:pPr>
       <w:r>
-        <w:rPr>
-          <w:b/>
-          <w:bCs/>
-        </w:rPr>
         <w:t xml:space="preserve">Authentication and notifications</w:t>
       </w:r>
     </w:p>
@@ -10747,17 +11565,13 @@
         <w:t xml:space="preserve">Notifications to residents over WhatsApp (where supported in country).</w:t>
       </w:r>
     </w:p>
-    <w:bookmarkEnd w:id="34"/>
-    <w:bookmarkStart w:id="35" w:name="reporting-and-administration"/>
+    <w:bookmarkEnd w:id="51"/>
+    <w:bookmarkStart w:id="52" w:name="reporting-and-administration"/>
     <w:p>
       <w:pPr>
         <w:pStyle w:val="Heading2"/>
       </w:pPr>
       <w:r>
-        <w:rPr>
-          <w:b/>
-          <w:bCs/>
-        </w:rPr>
         <w:t xml:space="preserve">Reporting and administration</w:t>
       </w:r>
     </w:p>
@@ -10967,21 +11781,20 @@
         </w:tc>
       </w:tr>
     </w:tbl>
-    <w:p>
-      <w:pPr>
-        <w:pStyle w:val="BodyText"/>
-      </w:pPr>
-      <w:r>
-        <w:rPr>
-          <w:b/>
-          <w:bCs/>
-        </w:rPr>
-        <w:t xml:space="preserve">16. Sandbox Hardening Before the Pilot</w:t>
-      </w:r>
-    </w:p>
-    <w:p>
-      <w:pPr>
-        <w:pStyle w:val="BodyText"/>
+    <w:bookmarkEnd w:id="52"/>
+    <w:bookmarkEnd w:id="53"/>
+    <w:bookmarkStart w:id="56" w:name="sandbox-hardening-before-the-pilot"/>
+    <w:p>
+      <w:pPr>
+        <w:pStyle w:val="Heading1"/>
+      </w:pPr>
+      <w:r>
+        <w:t xml:space="preserve">Sandbox Hardening Before the Pilot</w:t>
+      </w:r>
+    </w:p>
+    <w:p>
+      <w:pPr>
+        <w:pStyle w:val="FirstParagraph"/>
       </w:pPr>
       <w:r>
         <w:t xml:space="preserve">The pilot environment is built up incrementally during demos, training</w:t>
@@ -11017,17 +11830,12 @@
         <w:t xml:space="preserve">platform.</w:t>
       </w:r>
     </w:p>
-    <w:bookmarkEnd w:id="35"/>
-    <w:bookmarkStart w:id="36" w:name="cleaning-the-runtime"/>
+    <w:bookmarkStart w:id="54" w:name="cleaning-the-runtime"/>
     <w:p>
       <w:pPr>
         <w:pStyle w:val="Heading2"/>
       </w:pPr>
       <w:r>
-        <w:rPr>
-          <w:b/>
-          <w:bCs/>
-        </w:rPr>
         <w:t xml:space="preserve">Cleaning the runtime</w:t>
       </w:r>
     </w:p>
@@ -11070,17 +11878,13 @@
         <w:t xml:space="preserve">Clear ActiveMQ queues to avoid replaying dummy notifications.</w:t>
       </w:r>
     </w:p>
-    <w:bookmarkEnd w:id="36"/>
-    <w:bookmarkStart w:id="37" w:name="tightening-access"/>
+    <w:bookmarkEnd w:id="54"/>
+    <w:bookmarkStart w:id="55" w:name="tightening-access"/>
     <w:p>
       <w:pPr>
         <w:pStyle w:val="Heading2"/>
       </w:pPr>
       <w:r>
-        <w:rPr>
-          <w:b/>
-          <w:bCs/>
-        </w:rPr>
         <w:t xml:space="preserve">Tightening access</w:t>
       </w:r>
     </w:p>
@@ -11208,21 +12012,20 @@
         </w:tc>
       </w:tr>
     </w:tbl>
-    <w:p>
-      <w:pPr>
-        <w:pStyle w:val="BodyText"/>
-      </w:pPr>
-      <w:r>
-        <w:rPr>
-          <w:b/>
-          <w:bCs/>
-        </w:rPr>
-        <w:t xml:space="preserve">17. Registration Center — Operations and Logistics</w:t>
-      </w:r>
-    </w:p>
-    <w:p>
-      <w:pPr>
-        <w:pStyle w:val="BodyText"/>
+    <w:bookmarkEnd w:id="55"/>
+    <w:bookmarkEnd w:id="56"/>
+    <w:bookmarkStart w:id="67" w:name="X63a90e117386ad9df99630ba36ff2a51ccb32eb"/>
+    <w:p>
+      <w:pPr>
+        <w:pStyle w:val="Heading1"/>
+      </w:pPr>
+      <w:r>
+        <w:t xml:space="preserve">Registration Center — Operations and Logistics</w:t>
+      </w:r>
+    </w:p>
+    <w:p>
+      <w:pPr>
+        <w:pStyle w:val="FirstParagraph"/>
       </w:pPr>
       <w:r>
         <w:t xml:space="preserve">A registration Center is more than a room with laptops. It is a small</w:t>
@@ -11297,17 +12100,12 @@
         <w:t xml:space="preserve">reception → registration → print → exit.</w:t>
       </w:r>
     </w:p>
-    <w:bookmarkEnd w:id="37"/>
-    <w:bookmarkStart w:id="38" w:name="what-a-registration-center-comprises"/>
+    <w:bookmarkStart w:id="57" w:name="what-a-registration-center-comprises"/>
     <w:p>
       <w:pPr>
         <w:pStyle w:val="Heading2"/>
       </w:pPr>
       <w:r>
-        <w:rPr>
-          <w:b/>
-          <w:bCs/>
-        </w:rPr>
         <w:t xml:space="preserve">What a registration Center comprises</w:t>
       </w:r>
     </w:p>
@@ -11537,17 +12335,13 @@
         <w:t xml:space="preserve">know who to ask.</w:t>
       </w:r>
     </w:p>
-    <w:bookmarkEnd w:id="38"/>
-    <w:bookmarkStart w:id="39" w:name="registration-staff-per-center"/>
+    <w:bookmarkEnd w:id="57"/>
+    <w:bookmarkStart w:id="58" w:name="registration-staff-per-center"/>
     <w:p>
       <w:pPr>
         <w:pStyle w:val="Heading2"/>
       </w:pPr>
       <w:r>
-        <w:rPr>
-          <w:b/>
-          <w:bCs/>
-        </w:rPr>
         <w:t xml:space="preserve">Registration staff per Center</w:t>
       </w:r>
     </w:p>
@@ -11842,17 +12636,13 @@
         </w:tc>
       </w:tr>
     </w:tbl>
-    <w:bookmarkEnd w:id="39"/>
-    <w:bookmarkStart w:id="46" w:name="per-kit-configuration"/>
+    <w:bookmarkEnd w:id="58"/>
+    <w:bookmarkStart w:id="65" w:name="per-kit-configuration"/>
     <w:p>
       <w:pPr>
         <w:pStyle w:val="Heading2"/>
       </w:pPr>
       <w:r>
-        <w:rPr>
-          <w:b/>
-          <w:bCs/>
-        </w:rPr>
         <w:t xml:space="preserve">Per-kit configuration</w:t>
       </w:r>
     </w:p>
@@ -11876,16 +12666,12 @@
         <w:t xml:space="preserve">start of each day.</w:t>
       </w:r>
     </w:p>
-    <w:bookmarkStart w:id="40" w:name="workstation"/>
+    <w:bookmarkStart w:id="59" w:name="workstation"/>
     <w:p>
       <w:pPr>
         <w:pStyle w:val="Heading3"/>
       </w:pPr>
       <w:r>
-        <w:rPr>
-          <w:b/>
-          <w:bCs/>
-        </w:rPr>
         <w:t xml:space="preserve">Workstation</w:t>
       </w:r>
     </w:p>
@@ -11956,17 +12742,13 @@
         <w:t xml:space="preserve">External monitor for the resident is connected and tested.</w:t>
       </w:r>
     </w:p>
-    <w:bookmarkEnd w:id="40"/>
-    <w:bookmarkStart w:id="41" w:name="biometric-devices"/>
+    <w:bookmarkEnd w:id="59"/>
+    <w:bookmarkStart w:id="60" w:name="biometric-devices"/>
     <w:p>
       <w:pPr>
         <w:pStyle w:val="Heading3"/>
       </w:pPr>
       <w:r>
-        <w:rPr>
-          <w:b/>
-          <w:bCs/>
-        </w:rPr>
         <w:t xml:space="preserve">Biometric devices</w:t>
       </w:r>
     </w:p>
@@ -12031,17 +12813,13 @@
         <w:t xml:space="preserve">scheduled to expire during the pilot window.</w:t>
       </w:r>
     </w:p>
-    <w:bookmarkEnd w:id="41"/>
-    <w:bookmarkStart w:id="42" w:name="sbi-software"/>
+    <w:bookmarkEnd w:id="60"/>
+    <w:bookmarkStart w:id="61" w:name="sbi-software"/>
     <w:p>
       <w:pPr>
         <w:pStyle w:val="Heading3"/>
       </w:pPr>
       <w:r>
-        <w:rPr>
-          <w:b/>
-          <w:bCs/>
-        </w:rPr>
         <w:t xml:space="preserve">SBI software</w:t>
       </w:r>
     </w:p>
@@ -12096,17 +12874,13 @@
         <w:t xml:space="preserve">drivers in place.</w:t>
       </w:r>
     </w:p>
-    <w:bookmarkEnd w:id="42"/>
-    <w:bookmarkStart w:id="43" w:name="printer-and-scanner"/>
+    <w:bookmarkEnd w:id="61"/>
+    <w:bookmarkStart w:id="62" w:name="printer-and-scanner"/>
     <w:p>
       <w:pPr>
         <w:pStyle w:val="Heading3"/>
       </w:pPr>
       <w:r>
-        <w:rPr>
-          <w:b/>
-          <w:bCs/>
-        </w:rPr>
         <w:t xml:space="preserve">Printer and scanner</w:t>
       </w:r>
     </w:p>
@@ -12160,17 +12934,13 @@
         <w:t xml:space="preserve">Toner or ink stock checked; a spare cartridge is on site.</w:t>
       </w:r>
     </w:p>
-    <w:bookmarkEnd w:id="43"/>
-    <w:bookmarkStart w:id="44" w:name="photo-booth"/>
+    <w:bookmarkEnd w:id="62"/>
+    <w:bookmarkStart w:id="63" w:name="photo-booth"/>
     <w:p>
       <w:pPr>
         <w:pStyle w:val="Heading3"/>
       </w:pPr>
       <w:r>
-        <w:rPr>
-          <w:b/>
-          <w:bCs/>
-        </w:rPr>
         <w:t xml:space="preserve">Photo booth</w:t>
       </w:r>
     </w:p>
@@ -12236,17 +13006,13 @@
         <w:t xml:space="preserve">kit that fails during the day.</w:t>
       </w:r>
     </w:p>
-    <w:bookmarkEnd w:id="44"/>
-    <w:bookmarkStart w:id="45" w:name="operator-tooling"/>
+    <w:bookmarkEnd w:id="63"/>
+    <w:bookmarkStart w:id="64" w:name="operator-tooling"/>
     <w:p>
       <w:pPr>
         <w:pStyle w:val="Heading3"/>
       </w:pPr>
       <w:r>
-        <w:rPr>
-          <w:b/>
-          <w:bCs/>
-        </w:rPr>
         <w:t xml:space="preserve">Operator tooling</w:t>
       </w:r>
     </w:p>
@@ -12274,18 +13040,14 @@
         <w:t xml:space="preserve">resident has to be called back.</w:t>
       </w:r>
     </w:p>
-    <w:bookmarkEnd w:id="45"/>
-    <w:bookmarkEnd w:id="46"/>
-    <w:bookmarkStart w:id="47" w:name="print-station-for-id-cards"/>
+    <w:bookmarkEnd w:id="64"/>
+    <w:bookmarkEnd w:id="65"/>
+    <w:bookmarkStart w:id="66" w:name="print-station-for-id-cards"/>
     <w:p>
       <w:pPr>
         <w:pStyle w:val="Heading2"/>
       </w:pPr>
       <w:r>
-        <w:rPr>
-          <w:b/>
-          <w:bCs/>
-        </w:rPr>
         <w:t xml:space="preserve">Print station for ID cards</w:t>
       </w:r>
     </w:p>
@@ -12373,21 +13135,20 @@
         </w:tc>
       </w:tr>
     </w:tbl>
-    <w:p>
-      <w:pPr>
-        <w:pStyle w:val="BodyText"/>
-      </w:pPr>
-      <w:r>
-        <w:rPr>
-          <w:b/>
-          <w:bCs/>
-        </w:rPr>
-        <w:t xml:space="preserve">18. The Registration Workflow, Step by Step</w:t>
-      </w:r>
-    </w:p>
-    <w:p>
-      <w:pPr>
-        <w:pStyle w:val="BodyText"/>
+    <w:bookmarkEnd w:id="66"/>
+    <w:bookmarkEnd w:id="67"/>
+    <w:bookmarkStart w:id="74" w:name="the-registration-workflow-step-by-step"/>
+    <w:p>
+      <w:pPr>
+        <w:pStyle w:val="Heading1"/>
+      </w:pPr>
+      <w:r>
+        <w:t xml:space="preserve">The Registration Workflow, Step by Step</w:t>
+      </w:r>
+    </w:p>
+    <w:p>
+      <w:pPr>
+        <w:pStyle w:val="FirstParagraph"/>
       </w:pPr>
       <w:r>
         <w:t xml:space="preserve">Operators do not invent the flow on the spot, they follow a consistent</w:t>
@@ -12411,17 +13172,12 @@
         <w:t xml:space="preserve">acknowledgment.</w:t>
       </w:r>
     </w:p>
-    <w:bookmarkEnd w:id="47"/>
-    <w:bookmarkStart w:id="48" w:name="greeting-and-consent"/>
+    <w:bookmarkStart w:id="68" w:name="greeting-and-consent"/>
     <w:p>
       <w:pPr>
         <w:pStyle w:val="Heading2"/>
       </w:pPr>
       <w:r>
-        <w:rPr>
-          <w:b/>
-          <w:bCs/>
-        </w:rPr>
         <w:t xml:space="preserve">Greeting and consent</w:t>
       </w:r>
     </w:p>
@@ -12476,17 +13232,13 @@
         <w:t xml:space="preserve">demographic data on the evidence matches what will be entered.</w:t>
       </w:r>
     </w:p>
-    <w:bookmarkEnd w:id="48"/>
-    <w:bookmarkStart w:id="49" w:name="demographic-and-document-capture"/>
+    <w:bookmarkEnd w:id="68"/>
+    <w:bookmarkStart w:id="69" w:name="demographic-and-document-capture"/>
     <w:p>
       <w:pPr>
         <w:pStyle w:val="Heading2"/>
       </w:pPr>
       <w:r>
-        <w:rPr>
-          <w:b/>
-          <w:bCs/>
-        </w:rPr>
         <w:t xml:space="preserve">Demographic and document capture</w:t>
       </w:r>
     </w:p>
@@ -12524,17 +13276,13 @@
         <w:t xml:space="preserve">is legible before saving.</w:t>
       </w:r>
     </w:p>
-    <w:bookmarkEnd w:id="49"/>
-    <w:bookmarkStart w:id="50" w:name="biometric-capture"/>
+    <w:bookmarkEnd w:id="69"/>
+    <w:bookmarkStart w:id="70" w:name="biometric-capture"/>
     <w:p>
       <w:pPr>
         <w:pStyle w:val="Heading2"/>
       </w:pPr>
       <w:r>
-        <w:rPr>
-          <w:b/>
-          <w:bCs/>
-        </w:rPr>
         <w:t xml:space="preserve">Biometric capture</w:t>
       </w:r>
     </w:p>
@@ -12606,17 +13354,13 @@
         <w:t xml:space="preserve">moving on.</w:t>
       </w:r>
     </w:p>
-    <w:bookmarkEnd w:id="50"/>
-    <w:bookmarkStart w:id="51" w:name="preview-submit-and-acknowledge"/>
+    <w:bookmarkEnd w:id="70"/>
+    <w:bookmarkStart w:id="71" w:name="preview-submit-and-acknowledge"/>
     <w:p>
       <w:pPr>
         <w:pStyle w:val="Heading2"/>
       </w:pPr>
       <w:r>
-        <w:rPr>
-          <w:b/>
-          <w:bCs/>
-        </w:rPr>
         <w:t xml:space="preserve">Preview, submit and acknowledge</w:t>
       </w:r>
     </w:p>
@@ -12699,17 +13443,13 @@
         <w:t xml:space="preserve">as a back-up.</w:t>
       </w:r>
     </w:p>
-    <w:bookmarkEnd w:id="51"/>
-    <w:bookmarkStart w:id="52" w:name="closing-the-visit"/>
+    <w:bookmarkEnd w:id="71"/>
+    <w:bookmarkStart w:id="72" w:name="closing-the-visit"/>
     <w:p>
       <w:pPr>
         <w:pStyle w:val="Heading2"/>
       </w:pPr>
       <w:r>
-        <w:rPr>
-          <w:b/>
-          <w:bCs/>
-        </w:rPr>
         <w:t xml:space="preserve">Closing the visit</w:t>
       </w:r>
     </w:p>
@@ -12798,17 +13538,13 @@
         <w:t xml:space="preserve">next person in the queue.</w:t>
       </w:r>
     </w:p>
-    <w:bookmarkEnd w:id="52"/>
-    <w:bookmarkStart w:id="53" w:name="X555ac96c3db1fab967210b4aa0ab71a6ac99708"/>
+    <w:bookmarkEnd w:id="72"/>
+    <w:bookmarkStart w:id="73" w:name="X555ac96c3db1fab967210b4aa0ab71a6ac99708"/>
     <w:p>
       <w:pPr>
         <w:pStyle w:val="Heading2"/>
       </w:pPr>
       <w:r>
-        <w:rPr>
-          <w:b/>
-          <w:bCs/>
-        </w:rPr>
         <w:t xml:space="preserve">Supervisor responsibilities during the day</w:t>
       </w:r>
     </w:p>
@@ -12987,21 +13723,20 @@
         </w:tc>
       </w:tr>
     </w:tbl>
-    <w:p>
-      <w:pPr>
-        <w:pStyle w:val="BodyText"/>
-      </w:pPr>
-      <w:r>
-        <w:rPr>
-          <w:b/>
-          <w:bCs/>
-        </w:rPr>
-        <w:t xml:space="preserve">19. Best Practices for Biometric Capture</w:t>
-      </w:r>
-    </w:p>
-    <w:p>
-      <w:pPr>
-        <w:pStyle w:val="BodyText"/>
+    <w:bookmarkEnd w:id="73"/>
+    <w:bookmarkEnd w:id="74"/>
+    <w:bookmarkStart w:id="80" w:name="best-practices-for-biometric-capture"/>
+    <w:p>
+      <w:pPr>
+        <w:pStyle w:val="Heading1"/>
+      </w:pPr>
+      <w:r>
+        <w:t xml:space="preserve">Best Practices for Biometric Capture</w:t>
+      </w:r>
+    </w:p>
+    <w:p>
+      <w:pPr>
+        <w:pStyle w:val="FirstParagraph"/>
       </w:pPr>
       <w:r>
         <w:t xml:space="preserve">Biometric quality is the single largest determinant of authentication</w:t>
@@ -13037,17 +13772,12 @@
         <w:t xml:space="preserve">reinforced by supervisors on the floor.</w:t>
       </w:r>
     </w:p>
-    <w:bookmarkEnd w:id="53"/>
-    <w:bookmarkStart w:id="54" w:name="general-hygiene"/>
+    <w:bookmarkStart w:id="75" w:name="general-hygiene"/>
     <w:p>
       <w:pPr>
         <w:pStyle w:val="Heading2"/>
       </w:pPr>
       <w:r>
-        <w:rPr>
-          <w:b/>
-          <w:bCs/>
-        </w:rPr>
         <w:t xml:space="preserve">General hygiene</w:t>
       </w:r>
     </w:p>
@@ -13182,17 +13912,13 @@
         <w:t xml:space="preserve">3/4th open eyes etc</w:t>
       </w:r>
     </w:p>
-    <w:bookmarkEnd w:id="54"/>
-    <w:bookmarkStart w:id="55" w:name="fingerprint-capture"/>
+    <w:bookmarkEnd w:id="75"/>
+    <w:bookmarkStart w:id="76" w:name="fingerprint-capture"/>
     <w:p>
       <w:pPr>
         <w:pStyle w:val="Heading2"/>
       </w:pPr>
       <w:r>
-        <w:rPr>
-          <w:b/>
-          <w:bCs/>
-        </w:rPr>
         <w:t xml:space="preserve">Fingerprint capture</w:t>
       </w:r>
     </w:p>
@@ -13247,17 +13973,13 @@
         <w:t xml:space="preserve">remaining fingers.</w:t>
       </w:r>
     </w:p>
-    <w:bookmarkEnd w:id="55"/>
-    <w:bookmarkStart w:id="56" w:name="iris-capture"/>
+    <w:bookmarkEnd w:id="76"/>
+    <w:bookmarkStart w:id="77" w:name="iris-capture"/>
     <w:p>
       <w:pPr>
         <w:pStyle w:val="Heading2"/>
       </w:pPr>
       <w:r>
-        <w:rPr>
-          <w:b/>
-          <w:bCs/>
-        </w:rPr>
         <w:t xml:space="preserve">Iris capture</w:t>
       </w:r>
     </w:p>
@@ -13301,17 +14023,13 @@
         <w:t xml:space="preserve">capture.</w:t>
       </w:r>
     </w:p>
-    <w:bookmarkEnd w:id="56"/>
-    <w:bookmarkStart w:id="57" w:name="face-capture"/>
+    <w:bookmarkEnd w:id="77"/>
+    <w:bookmarkStart w:id="78" w:name="face-capture"/>
     <w:p>
       <w:pPr>
         <w:pStyle w:val="Heading2"/>
       </w:pPr>
       <w:r>
-        <w:rPr>
-          <w:b/>
-          <w:bCs/>
-        </w:rPr>
         <w:t xml:space="preserve">Face capture</w:t>
       </w:r>
     </w:p>
@@ -13432,17 +14150,13 @@
         <w:t xml:space="preserve">against ICAO references during training.</w:t>
       </w:r>
     </w:p>
-    <w:bookmarkEnd w:id="57"/>
-    <w:bookmarkStart w:id="58" w:name="capturing-exceptions"/>
+    <w:bookmarkEnd w:id="78"/>
+    <w:bookmarkStart w:id="79" w:name="capturing-exceptions"/>
     <w:p>
       <w:pPr>
         <w:pStyle w:val="Heading2"/>
       </w:pPr>
       <w:r>
-        <w:rPr>
-          <w:b/>
-          <w:bCs/>
-        </w:rPr>
         <w:t xml:space="preserve">Capturing exceptions</w:t>
       </w:r>
     </w:p>
@@ -13606,21 +14320,20 @@
         </w:tc>
       </w:tr>
     </w:tbl>
-    <w:p>
-      <w:pPr>
-        <w:pStyle w:val="BodyText"/>
-      </w:pPr>
-      <w:r>
-        <w:rPr>
-          <w:b/>
-          <w:bCs/>
-        </w:rPr>
-        <w:t xml:space="preserve">20. User Acceptance Testing</w:t>
-      </w:r>
-    </w:p>
-    <w:p>
-      <w:pPr>
-        <w:pStyle w:val="BodyText"/>
+    <w:bookmarkEnd w:id="79"/>
+    <w:bookmarkEnd w:id="80"/>
+    <w:bookmarkStart w:id="83" w:name="user-acceptance-testing"/>
+    <w:p>
+      <w:pPr>
+        <w:pStyle w:val="Heading1"/>
+      </w:pPr>
+      <w:r>
+        <w:t xml:space="preserve">User Acceptance Testing</w:t>
+      </w:r>
+    </w:p>
+    <w:p>
+      <w:pPr>
+        <w:pStyle w:val="FirstParagraph"/>
       </w:pPr>
       <w:r>
         <w:t xml:space="preserve">User Acceptance Testing is the country team’s formal sign-off that the</w:t>
@@ -13644,17 +14357,12 @@
         <w:t xml:space="preserve">and go-live.</w:t>
       </w:r>
     </w:p>
-    <w:bookmarkEnd w:id="58"/>
-    <w:bookmarkStart w:id="59" w:name="exit-criteria"/>
+    <w:bookmarkStart w:id="81" w:name="exit-criteria"/>
     <w:p>
       <w:pPr>
         <w:pStyle w:val="Heading2"/>
       </w:pPr>
       <w:r>
-        <w:rPr>
-          <w:b/>
-          <w:bCs/>
-        </w:rPr>
         <w:t xml:space="preserve">Exit criteria</w:t>
       </w:r>
     </w:p>
@@ -13726,17 +14434,13 @@
         <w:t xml:space="preserve">showing they can run the platform, not just operate it.</w:t>
       </w:r>
     </w:p>
-    <w:bookmarkEnd w:id="59"/>
-    <w:bookmarkStart w:id="60" w:name="test-scenarios-to-cover"/>
+    <w:bookmarkEnd w:id="81"/>
+    <w:bookmarkStart w:id="82" w:name="test-scenarios-to-cover"/>
     <w:p>
       <w:pPr>
         <w:pStyle w:val="Heading2"/>
       </w:pPr>
       <w:r>
-        <w:rPr>
-          <w:b/>
-          <w:bCs/>
-        </w:rPr>
         <w:t xml:space="preserve">Test scenarios to cover</w:t>
       </w:r>
     </w:p>
@@ -13842,21 +14546,20 @@
         </w:tc>
       </w:tr>
     </w:tbl>
-    <w:p>
-      <w:pPr>
-        <w:pStyle w:val="BodyText"/>
-      </w:pPr>
-      <w:r>
-        <w:rPr>
-          <w:b/>
-          <w:bCs/>
-        </w:rPr>
-        <w:t xml:space="preserve">21. Pre Go-Live Readiness</w:t>
-      </w:r>
-    </w:p>
-    <w:p>
-      <w:pPr>
-        <w:pStyle w:val="BodyText"/>
+    <w:bookmarkEnd w:id="82"/>
+    <w:bookmarkEnd w:id="83"/>
+    <w:bookmarkStart w:id="87" w:name="pre-go-live-readiness"/>
+    <w:p>
+      <w:pPr>
+        <w:pStyle w:val="Heading1"/>
+      </w:pPr>
+      <w:r>
+        <w:t xml:space="preserve">Pre Go-Live Readiness</w:t>
+      </w:r>
+    </w:p>
+    <w:p>
+      <w:pPr>
+        <w:pStyle w:val="FirstParagraph"/>
       </w:pPr>
       <w:r>
         <w:t xml:space="preserve">In the one to two weeks before residents start arriving, the program</w:t>
@@ -13880,17 +14583,12 @@
         <w:t xml:space="preserve">safety is in place and visible to the country leadership.</w:t>
       </w:r>
     </w:p>
-    <w:bookmarkEnd w:id="60"/>
-    <w:bookmarkStart w:id="61" w:name="platform-and-end-to-end-sanity"/>
+    <w:bookmarkStart w:id="84" w:name="platform-and-end-to-end-sanity"/>
     <w:p>
       <w:pPr>
         <w:pStyle w:val="Heading2"/>
       </w:pPr>
       <w:r>
-        <w:rPr>
-          <w:b/>
-          <w:bCs/>
-        </w:rPr>
         <w:t xml:space="preserve">Platform and end-to-end sanity</w:t>
       </w:r>
     </w:p>
@@ -13933,17 +14631,13 @@
         <w:t xml:space="preserve">Sandbox hardening (Section 16) completed and signed off.</w:t>
       </w:r>
     </w:p>
-    <w:bookmarkEnd w:id="61"/>
-    <w:bookmarkStart w:id="62" w:name="communications-and-public-relations"/>
+    <w:bookmarkEnd w:id="84"/>
+    <w:bookmarkStart w:id="85" w:name="communications-and-public-relations"/>
     <w:p>
       <w:pPr>
         <w:pStyle w:val="Heading2"/>
       </w:pPr>
       <w:r>
-        <w:rPr>
-          <w:b/>
-          <w:bCs/>
-        </w:rPr>
         <w:t xml:space="preserve">Communications and public relations</w:t>
       </w:r>
     </w:p>
@@ -14031,17 +14725,13 @@
         <w:t xml:space="preserve">Media engagement plan agreed with the country authority.</w:t>
       </w:r>
     </w:p>
-    <w:bookmarkEnd w:id="62"/>
-    <w:bookmarkStart w:id="63" w:name="center-logistics-and-safety"/>
+    <w:bookmarkEnd w:id="85"/>
+    <w:bookmarkStart w:id="86" w:name="center-logistics-and-safety"/>
     <w:p>
       <w:pPr>
         <w:pStyle w:val="Heading2"/>
       </w:pPr>
       <w:r>
-        <w:rPr>
-          <w:b/>
-          <w:bCs/>
-        </w:rPr>
         <w:t xml:space="preserve">Center logistics and safety</w:t>
       </w:r>
     </w:p>
@@ -14208,21 +14898,20 @@
         </w:tc>
       </w:tr>
     </w:tbl>
-    <w:p>
-      <w:pPr>
-        <w:pStyle w:val="BodyText"/>
-      </w:pPr>
-      <w:r>
-        <w:rPr>
-          <w:b/>
-          <w:bCs/>
-        </w:rPr>
-        <w:t xml:space="preserve">22. Go-Live Strategy — Internal Then External</w:t>
-      </w:r>
-    </w:p>
-    <w:p>
-      <w:pPr>
-        <w:pStyle w:val="BodyText"/>
+    <w:bookmarkEnd w:id="86"/>
+    <w:bookmarkEnd w:id="87"/>
+    <w:bookmarkStart w:id="91" w:name="go-live-strategy-internal-then-external"/>
+    <w:p>
+      <w:pPr>
+        <w:pStyle w:val="Heading1"/>
+      </w:pPr>
+      <w:r>
+        <w:t xml:space="preserve">Go-Live Strategy — Internal Then External</w:t>
+      </w:r>
+    </w:p>
+    <w:p>
+      <w:pPr>
+        <w:pStyle w:val="FirstParagraph"/>
       </w:pPr>
       <w:r>
         <w:t xml:space="preserve">Going live is staged. The pilot starts with a small, internal go-live to</w:t>
@@ -14252,17 +14941,12 @@
         <w:t xml:space="preserve">is small.</w:t>
       </w:r>
     </w:p>
-    <w:bookmarkEnd w:id="63"/>
-    <w:bookmarkStart w:id="64" w:name="internal-go-live"/>
+    <w:bookmarkStart w:id="88" w:name="internal-go-live"/>
     <w:p>
       <w:pPr>
         <w:pStyle w:val="Heading2"/>
       </w:pPr>
       <w:r>
-        <w:rPr>
-          <w:b/>
-          <w:bCs/>
-        </w:rPr>
         <w:t xml:space="preserve">Internal go-live</w:t>
       </w:r>
     </w:p>
@@ -14340,17 +15024,13 @@
         <w:t xml:space="preserve">MOSIP team.</w:t>
       </w:r>
     </w:p>
-    <w:bookmarkEnd w:id="64"/>
-    <w:bookmarkStart w:id="65" w:name="external-go-live-phased-ramp"/>
+    <w:bookmarkEnd w:id="88"/>
+    <w:bookmarkStart w:id="89" w:name="external-go-live-phased-ramp"/>
     <w:p>
       <w:pPr>
         <w:pStyle w:val="Heading2"/>
       </w:pPr>
       <w:r>
-        <w:rPr>
-          <w:b/>
-          <w:bCs/>
-        </w:rPr>
         <w:t xml:space="preserve">External go-live — phased ramp</w:t>
       </w:r>
     </w:p>
@@ -14549,24 +15229,13 @@
         </w:tc>
       </w:tr>
     </w:tbl>
-    <w:bookmarkEnd w:id="65"/>
-    <w:bookmarkStart w:id="66" w:name="section-1"/>
+    <w:bookmarkEnd w:id="89"/>
+    <w:bookmarkStart w:id="90" w:name="daily-reporting-during-go-live"/>
     <w:p>
       <w:pPr>
         <w:pStyle w:val="Heading2"/>
       </w:pPr>
-    </w:p>
-    <w:bookmarkEnd w:id="66"/>
-    <w:bookmarkStart w:id="67" w:name="daily-reporting-during-go-live"/>
-    <w:p>
-      <w:pPr>
-        <w:pStyle w:val="Heading2"/>
-      </w:pPr>
-      <w:r>
-        <w:rPr>
-          <w:b/>
-          <w:bCs/>
-        </w:rPr>
+      <w:r>
         <w:t xml:space="preserve">Daily reporting during go-live</w:t>
       </w:r>
     </w:p>
@@ -14707,21 +15376,20 @@
         </w:tc>
       </w:tr>
     </w:tbl>
-    <w:p>
-      <w:pPr>
-        <w:pStyle w:val="BodyText"/>
-      </w:pPr>
-      <w:r>
-        <w:rPr>
-          <w:b/>
-          <w:bCs/>
-        </w:rPr>
-        <w:t xml:space="preserve">23. Governance and Review Cadence</w:t>
-      </w:r>
-    </w:p>
-    <w:p>
-      <w:pPr>
-        <w:pStyle w:val="BodyText"/>
+    <w:bookmarkEnd w:id="90"/>
+    <w:bookmarkEnd w:id="91"/>
+    <w:bookmarkStart w:id="92" w:name="governance-and-review-cadence"/>
+    <w:p>
+      <w:pPr>
+        <w:pStyle w:val="Heading1"/>
+      </w:pPr>
+      <w:r>
+        <w:t xml:space="preserve">Governance and Review Cadence</w:t>
+      </w:r>
+    </w:p>
+    <w:p>
+      <w:pPr>
+        <w:pStyle w:val="FirstParagraph"/>
       </w:pPr>
       <w:r>
         <w:t xml:space="preserve">A lightweight, predictable governance structure keeps decisions moving</w:t>
@@ -15158,29 +15826,22 @@
         </w:tc>
       </w:tr>
     </w:tbl>
-    <w:p>
-      <w:pPr>
-        <w:pStyle w:val="BodyText"/>
-      </w:pPr>
-      <w:r>
-        <w:rPr>
-          <w:b/>
-          <w:bCs/>
-        </w:rPr>
-        <w:t xml:space="preserve">24. Critical Success Factors and Risks</w:t>
-      </w:r>
-    </w:p>
-    <w:bookmarkEnd w:id="67"/>
-    <w:bookmarkStart w:id="68" w:name="success-factors"/>
+    <w:bookmarkEnd w:id="92"/>
+    <w:bookmarkStart w:id="95" w:name="critical-success-factors-and-risks"/>
+    <w:p>
+      <w:pPr>
+        <w:pStyle w:val="Heading1"/>
+      </w:pPr>
+      <w:r>
+        <w:t xml:space="preserve">Critical Success Factors and Risks**</w:t>
+      </w:r>
+    </w:p>
+    <w:bookmarkStart w:id="93" w:name="success-factors"/>
     <w:p>
       <w:pPr>
         <w:pStyle w:val="Heading2"/>
       </w:pPr>
       <w:r>
-        <w:rPr>
-          <w:b/>
-          <w:bCs/>
-        </w:rPr>
         <w:t xml:space="preserve">Success factors</w:t>
       </w:r>
     </w:p>
@@ -15321,17 +15982,13 @@
         <w:t xml:space="preserve">examinations and grading to operators.</w:t>
       </w:r>
     </w:p>
-    <w:bookmarkEnd w:id="68"/>
-    <w:bookmarkStart w:id="69" w:name="top-risks-and-mitigations"/>
+    <w:bookmarkEnd w:id="93"/>
+    <w:bookmarkStart w:id="94" w:name="top-risks-and-mitigations"/>
     <w:p>
       <w:pPr>
         <w:pStyle w:val="Heading2"/>
       </w:pPr>
       <w:r>
-        <w:rPr>
-          <w:b/>
-          <w:bCs/>
-        </w:rPr>
         <w:t xml:space="preserve">Top risks and mitigations</w:t>
       </w:r>
     </w:p>
@@ -15893,21 +16550,20 @@
         </w:tc>
       </w:tr>
     </w:tbl>
-    <w:p>
-      <w:pPr>
-        <w:pStyle w:val="BodyText"/>
-      </w:pPr>
-      <w:r>
-        <w:rPr>
-          <w:b/>
-          <w:bCs/>
-        </w:rPr>
-        <w:t xml:space="preserve">25. Pilot Closure and Hand-Off</w:t>
-      </w:r>
-    </w:p>
-    <w:p>
-      <w:pPr>
-        <w:pStyle w:val="BodyText"/>
+    <w:bookmarkEnd w:id="94"/>
+    <w:bookmarkEnd w:id="95"/>
+    <w:bookmarkStart w:id="99" w:name="pilot-closure-and-hand-off"/>
+    <w:p>
+      <w:pPr>
+        <w:pStyle w:val="Heading1"/>
+      </w:pPr>
+      <w:r>
+        <w:t xml:space="preserve">Pilot Closure and Hand-Off</w:t>
+      </w:r>
+    </w:p>
+    <w:p>
+      <w:pPr>
+        <w:pStyle w:val="FirstParagraph"/>
       </w:pPr>
       <w:r>
         <w:t xml:space="preserve">Closure is not just turning the lights off. It is the moment the country</w:t>
@@ -15937,17 +16593,12 @@
         <w:t xml:space="preserve">transition.</w:t>
       </w:r>
     </w:p>
-    <w:bookmarkEnd w:id="69"/>
-    <w:bookmarkStart w:id="70" w:name="formal-closure"/>
+    <w:bookmarkStart w:id="96" w:name="formal-closure"/>
     <w:p>
       <w:pPr>
         <w:pStyle w:val="Heading2"/>
       </w:pPr>
       <w:r>
-        <w:rPr>
-          <w:b/>
-          <w:bCs/>
-        </w:rPr>
         <w:t xml:space="preserve">Formal closure</w:t>
       </w:r>
     </w:p>
@@ -15985,17 +16636,13 @@
         <w:t xml:space="preserve">registration, authentication, exceptions, dashboards.</w:t>
       </w:r>
     </w:p>
-    <w:bookmarkEnd w:id="70"/>
-    <w:bookmarkStart w:id="71" w:name="capturing-field-experience"/>
+    <w:bookmarkEnd w:id="96"/>
+    <w:bookmarkStart w:id="97" w:name="capturing-field-experience"/>
     <w:p>
       <w:pPr>
         <w:pStyle w:val="Heading2"/>
       </w:pPr>
       <w:r>
-        <w:rPr>
-          <w:b/>
-          <w:bCs/>
-        </w:rPr>
         <w:t xml:space="preserve">Capturing field experience</w:t>
       </w:r>
     </w:p>
@@ -16055,17 +16702,13 @@
         <w:t xml:space="preserve">Send a formal pilot closure report to the MOSIP team.</w:t>
       </w:r>
     </w:p>
-    <w:bookmarkEnd w:id="71"/>
-    <w:bookmarkStart w:id="72" w:name="closure-deliverables"/>
+    <w:bookmarkEnd w:id="97"/>
+    <w:bookmarkStart w:id="98" w:name="closure-deliverables"/>
     <w:p>
       <w:pPr>
         <w:pStyle w:val="Heading2"/>
       </w:pPr>
       <w:r>
-        <w:rPr>
-          <w:b/>
-          <w:bCs/>
-        </w:rPr>
         <w:t xml:space="preserve">Closure deliverables</w:t>
       </w:r>
     </w:p>
@@ -16216,21 +16859,20 @@
         </w:tc>
       </w:tr>
     </w:tbl>
-    <w:p>
-      <w:pPr>
-        <w:pStyle w:val="BodyText"/>
-      </w:pPr>
-      <w:r>
-        <w:rPr>
-          <w:b/>
-          <w:bCs/>
-        </w:rPr>
+    <w:bookmarkEnd w:id="98"/>
+    <w:bookmarkEnd w:id="99"/>
+    <w:bookmarkStart w:id="100" w:name="appendix-a"/>
+    <w:p>
+      <w:pPr>
+        <w:pStyle w:val="Heading1"/>
+      </w:pPr>
+      <w:r>
         <w:t xml:space="preserve">Appendix A</w:t>
       </w:r>
     </w:p>
     <w:p>
       <w:pPr>
-        <w:pStyle w:val="BodyText"/>
+        <w:pStyle w:val="FirstParagraph"/>
       </w:pPr>
       <w:r>
         <w:rPr>
@@ -16719,21 +17361,19 @@
         </w:tc>
       </w:tr>
     </w:tbl>
-    <w:p>
-      <w:pPr>
-        <w:pStyle w:val="BodyText"/>
-      </w:pPr>
-      <w:r>
-        <w:rPr>
-          <w:b/>
-          <w:bCs/>
-        </w:rPr>
+    <w:bookmarkEnd w:id="100"/>
+    <w:bookmarkStart w:id="101" w:name="appendix-b"/>
+    <w:p>
+      <w:pPr>
+        <w:pStyle w:val="Heading1"/>
+      </w:pPr>
+      <w:r>
         <w:t xml:space="preserve">Appendix B</w:t>
       </w:r>
     </w:p>
     <w:p>
       <w:pPr>
-        <w:pStyle w:val="BodyText"/>
+        <w:pStyle w:val="FirstParagraph"/>
       </w:pPr>
       <w:r>
         <w:rPr>
@@ -17122,21 +17762,19 @@
         </w:tc>
       </w:tr>
     </w:tbl>
-    <w:p>
-      <w:pPr>
-        <w:pStyle w:val="BodyText"/>
-      </w:pPr>
-      <w:r>
-        <w:rPr>
-          <w:b/>
-          <w:bCs/>
-        </w:rPr>
+    <w:bookmarkEnd w:id="101"/>
+    <w:bookmarkStart w:id="105" w:name="appendix-c"/>
+    <w:p>
+      <w:pPr>
+        <w:pStyle w:val="Heading1"/>
+      </w:pPr>
+      <w:r>
         <w:t xml:space="preserve">Appendix C</w:t>
       </w:r>
     </w:p>
     <w:p>
       <w:pPr>
-        <w:pStyle w:val="BodyText"/>
+        <w:pStyle w:val="FirstParagraph"/>
       </w:pPr>
       <w:r>
         <w:rPr>
@@ -17184,17 +17822,12 @@
         <w:t xml:space="preserve">responsibly at scale.</w:t>
       </w:r>
     </w:p>
-    <w:bookmarkEnd w:id="72"/>
-    <w:bookmarkStart w:id="73" w:name="what-the-team-experiences"/>
+    <w:bookmarkStart w:id="102" w:name="what-the-team-experiences"/>
     <w:p>
       <w:pPr>
         <w:pStyle w:val="Heading2"/>
       </w:pPr>
       <w:r>
-        <w:rPr>
-          <w:b/>
-          <w:bCs/>
-        </w:rPr>
         <w:t xml:space="preserve">What the Team Experiences</w:t>
       </w:r>
     </w:p>
@@ -18034,17 +18667,13 @@
         </w:tc>
       </w:tr>
     </w:tbl>
-    <w:bookmarkEnd w:id="73"/>
-    <w:bookmarkStart w:id="74" w:name="Xac81f54fd029fd24ab511fe2c6cb5bd769c2189"/>
+    <w:bookmarkEnd w:id="102"/>
+    <w:bookmarkStart w:id="103" w:name="Xac81f54fd029fd24ab511fe2c6cb5bd769c2189"/>
     <w:p>
       <w:pPr>
         <w:pStyle w:val="Heading2"/>
       </w:pPr>
       <w:r>
-        <w:rPr>
-          <w:b/>
-          <w:bCs/>
-        </w:rPr>
         <w:t xml:space="preserve">Key privacy behaviors observed during Registration</w:t>
       </w:r>
     </w:p>
@@ -18237,17 +18866,13 @@
         </w:tc>
       </w:tr>
     </w:tbl>
-    <w:bookmarkEnd w:id="74"/>
-    <w:bookmarkStart w:id="75" w:name="X095e34d91bd5c9291beadf21cc1310af455f5a6"/>
+    <w:bookmarkEnd w:id="103"/>
+    <w:bookmarkStart w:id="104" w:name="X095e34d91bd5c9291beadf21cc1310af455f5a6"/>
     <w:p>
       <w:pPr>
         <w:pStyle w:val="Heading2"/>
       </w:pPr>
       <w:r>
-        <w:rPr>
-          <w:b/>
-          <w:bCs/>
-        </w:rPr>
         <w:t xml:space="preserve">Questions to guide your team’s security discussion</w:t>
       </w:r>
     </w:p>
@@ -18591,8 +19216,8 @@
         </w:tc>
       </w:tr>
     </w:tbl>
-    <w:bookmarkEnd w:id="75"/>
-    <w:bookmarkEnd w:id="76"/>
+    <w:bookmarkEnd w:id="104"/>
+    <w:bookmarkEnd w:id="105"/>
     <w:sectPr>
       <w:footnotePr>
         <w:numRestart w:val="eachSect"/>

</xml_diff>